<commit_message>
Update submission documents and landing copy for accounts, document reads, decisions and hosting
</commit_message>
<xml_diff>
--- a/SUBMISSION/1_Technical_Documentation.docx
+++ b/SUBMISSION/1_Technical_Documentation.docx
@@ -1166,7 +1166,7 @@
         <w:t>clauseguard/llm.py::pool_status</w:t>
       </w:r>
       <w:r>
-        <w:t>); no solver or permission-tier decision reads it, and the agent falls back to deterministic templates and rule-based parsing automatically regardless of what it reports.</w:t>
+        <w:t>); no solver or permission-tier decision reads it.</w:t>
       </w:r>
     </w:p>
     <w:p>
@@ -1361,7 +1361,112 @@
         <w:t>/insurer</w:t>
       </w:r>
       <w:r>
-        <w:t>). The sandbox insurer's desk, behind a separate back-office token the agent has no tool for, lists submitted claims with the form and attachments, moves them through received, under review, approved, rejected or paid with a note, and holds the halt switch that refuses every agent action for every customer. Decisions and notes flow back to the customer's digest as claim-status items (with an appeal route after a rejection), closing the loop: the agent prepares and submits, a person decides, the agent reports.</w:t>
+        <w:t>). The sandbox insurer's desk, behind a separate back-office token the agent has no tool for, lists submitted claims with the form and attachments, moves them through received, under review, approved, rejected or paid with a note, and holds the halt switch that refuses every agent action for every customer. Decisions and notes flow back to the customer's digest as claim-status items (with an appeal route after a rejection), closing the loop: the agent prepares and submits, a person decides, the agent reports. The adjuster can open every attached file from the claim, and appeals and attachments the agent files after the customer's confirmation land on the same claim.</w:t>
+      </w:r>
+    </w:p>
+    <w:p>
+      <w:r>
+        <w:rPr>
+          <w:b/>
+        </w:rPr>
+        <w:t>What the customer's documents say</w:t>
+      </w:r>
+      <w:r>
+        <w:t xml:space="preserve"> (</w:t>
+      </w:r>
+      <w:r>
+        <w:rPr>
+          <w:rFonts w:ascii="Consolas" w:hAnsi="Consolas"/>
+          <w:sz w:val="19"/>
+        </w:rPr>
+        <w:t>agent/doc_facts.py</w:t>
+      </w:r>
+      <w:r>
+        <w:t>). A customer can start a claim by sending files alone. The model reads the extractor's typed summaries (type, dates, days in hospital, ICD-10 code; never the raw text) and answers in the rules' own vocabulary: an inpatient stay, an illness, the diagnosis. Each answer is a closed choice checked again in code (a stay only with typed date or day evidence, an illness only, never an assumed accident, a diagnosis only from the known list). A discharge date printed on a discharge summary replaces one the assistant had only derived from a stated day count. The reply carries, per file, what was read (amounts, dates, diagnosis, charges, whether the patient is the policyholder), the checks that failed (hidden text, totals that do not add up, the same stay coded differently across files) and which of the insurer's requirements the file now satisfies, so the customer sees what the claim rests on.</w:t>
+      </w:r>
+    </w:p>
+    <w:p>
+      <w:r>
+        <w:rPr>
+          <w:b/>
+        </w:rPr>
+        <w:t>Asking instead of guessing</w:t>
+      </w:r>
+      <w:r>
+        <w:t xml:space="preserve"> (</w:t>
+      </w:r>
+      <w:r>
+        <w:rPr>
+          <w:rFonts w:ascii="Consolas" w:hAnsi="Consolas"/>
+          <w:sz w:val="19"/>
+        </w:rPr>
+        <w:t>agent/policy_pick.py</w:t>
+      </w:r>
+      <w:r>
+        <w:t>). When more than one policy could take a claim, the customer is asked which to file first, with one button per policy; the model may name the one the message clearly means, from a closed list of candidates. A request to act is accepted only when the model reads an explicit request or an accepted offer, so a greeting never prepares a submission.</w:t>
+      </w:r>
+    </w:p>
+    <w:p>
+      <w:r>
+        <w:rPr>
+          <w:b/>
+        </w:rPr>
+        <w:t>Answering what was asked.</w:t>
+      </w:r>
+      <w:r>
+        <w:t xml:space="preserve"> The planner model also reads what the turn is about (documents to prepare, how to submit, the deadline, what happens if late, the amount, a filed claim's progress). For those questions the code puts the deterministic answer first: the documents required and still missing with the next step, or the late-filing effect and the last day. Progress questions read the live status of the claim at the insurer's desk, with the assessor's note, and a decision reaches the chat by itself: the agent states it, and for a rejection the model classifies the assessor's note (</w:t>
+      </w:r>
+      <w:r>
+        <w:rPr>
+          <w:rFonts w:ascii="Consolas" w:hAnsi="Consolas"/>
+          <w:sz w:val="19"/>
+        </w:rPr>
+        <w:t>agent/decision_read.py</w:t>
+      </w:r>
+      <w:r>
+        <w:t>) as a defect the customer can fix, a reason the policy facts contradict (an appeal is offered, quoting the clause by its printed section), or a valid reason.</w:t>
+      </w:r>
+    </w:p>
+    <w:p>
+      <w:r>
+        <w:rPr>
+          <w:b/>
+        </w:rPr>
+        <w:t>Wording.</w:t>
+      </w:r>
+      <w:r>
+        <w:t xml:space="preserve"> The reply writer (</w:t>
+      </w:r>
+      <w:r>
+        <w:rPr>
+          <w:rFonts w:ascii="Consolas" w:hAnsi="Consolas"/>
+          <w:sz w:val="19"/>
+        </w:rPr>
+        <w:t>agent/composer.py</w:t>
+      </w:r>
+      <w:r>
+        <w:t>) receives the engine's payload, the last four exchanges as data for reading references, and six worked examples. It reasons privately, writes two candidate replies and names its pick; the verifier tries the pick and then the other candidate, and only when both state a value that is not in the payload is the deterministic text used. Small talk, thanks and off-topic requests are answered by the model in the customer's language (</w:t>
+      </w:r>
+      <w:r>
+        <w:rPr>
+          <w:rFonts w:ascii="Consolas" w:hAnsi="Consolas"/>
+          <w:sz w:val="19"/>
+        </w:rPr>
+        <w:t>agent/smalltalk.py</w:t>
+      </w:r>
+      <w:r>
+        <w:t>). The customer can correct a form value from the confirmation card (insured or claimant name, hospital, diagnosis, dates, bill); the change goes back through the agent as the customer's own correction and the form is rebuilt. A correction that names no value is answered with what the form currently says, never "updated"; a request to relabel the event to fit another policy is refused as misrepresentation.</w:t>
+      </w:r>
+    </w:p>
+    <w:p>
+      <w:r>
+        <w:rPr>
+          <w:b/>
+        </w:rPr>
+        <w:t>When the model is unavailable.</w:t>
+      </w:r>
+      <w:r>
+        <w:t xml:space="preserve"> Keys are rotated per request; a per-minute limit rests a key for about a minute, a key the API rejects is taken out of rotation. If no key can serve a turn, the reply says so in the customer's language (quota reached, key not accepted, service not responding) and offers the customer's own Gemini key, which is checked once with Google and kept only in that session's memory. The cards from the engine still show; no rule-based text is presented as the assistant's answer.</w:t>
       </w:r>
     </w:p>
     <w:p>
@@ -3349,7 +3454,40 @@
         <w:t>python -m pytest -q</w:t>
       </w:r>
       <w:r>
-        <w:t>: 532 passed, 1 skipped (2026-10-14, no API key, 2162s).</w:t>
+        <w:t>: 554 passed, 1 skipped (2026-10-19, no API key, tests isolated from the hosted database and from the developer's environment file).</w:t>
+      </w:r>
+    </w:p>
+    <w:p>
+      <w:pPr>
+        <w:pStyle w:val="Heading2"/>
+      </w:pPr>
+      <w:r>
+        <w:rPr>
+          <w:color w:val="14213D"/>
+        </w:rPr>
+        <w:t>4.12 Conversation quality</w:t>
+      </w:r>
+    </w:p>
+    <w:p>
+      <w:r>
+        <w:rPr>
+          <w:rFonts w:ascii="Consolas" w:hAnsi="Consolas"/>
+          <w:sz w:val="19"/>
+        </w:rPr>
+        <w:t>python scripts/conversation_eval.py</w:t>
+      </w:r>
+      <w:r>
+        <w:t xml:space="preserve"> runs 32 fixed conversations, 47 turns in all (Indonesian, English, slang, typos, mixed language, long narratives, corrections, what-ifs, topic switches, small talk, refusals, attacks), against a running backend, and checks each reply with language-independent anchors (what the answer must carry and must not do, the reply language, how the turn relates to the conversation, whether an action was prepared). The report is written to </w:t>
+      </w:r>
+      <w:r>
+        <w:rPr>
+          <w:rFonts w:ascii="Consolas" w:hAnsi="Consolas"/>
+          <w:sz w:val="19"/>
+        </w:rPr>
+        <w:t>evidence/conversation_eval_&lt;label&gt;.json</w:t>
+      </w:r>
+      <w:r>
+        <w:t xml:space="preserve"> so every prompt change is measured against the last. Before the reply-writer rewrite (few-shot examples, private reasoning, two candidates, recent turns as data): 40 of 47 turns passed (85%), 28 of 47 replies model-written. After: 42 of 47 (89%), 30 of 47. The remaining failures were then fixed in code (question focus, Indonesian account-change wording, deadline worry read as a deadline question, choice only among decided policies); a full re-run after those fixes is not reported here. The set is team-written.</w:t>
       </w:r>
     </w:p>
     <w:p>
@@ -3548,6 +3686,22 @@
     </w:p>
     <w:p>
       <w:pPr>
+        <w:pStyle w:val="ListBullet"/>
+      </w:pPr>
+      <w:r>
+        <w:t>The agent's working memory of a conversation (facts, documents read, a form waiting for Confirm) lives in the backend process; a restart or redeploy ends it, and the customer is told so and asked to restate the situation. Saved chats and filed claims are unaffected.</w:t>
+      </w:r>
+    </w:p>
+    <w:p>
+      <w:pPr>
+        <w:pStyle w:val="ListBullet"/>
+      </w:pPr>
+      <w:r>
+        <w:t>A claim already filed cannot be amended in place; a fixable rejection is answered with a new, corrected submission after the customer's confirmation.</w:t>
+      </w:r>
+    </w:p>
+    <w:p>
+      <w:pPr>
         <w:pStyle w:val="Heading1"/>
       </w:pPr>
       <w:r>
@@ -3765,7 +3919,17 @@
         <w:t>deploy/storage.md</w:t>
       </w:r>
       <w:r>
-        <w:t>.</w:t>
+        <w:t xml:space="preserve">. Since 2026-10-18 the demo also runs fully hosted on Railway: the web service at </w:t>
+      </w:r>
+      <w:r>
+        <w:rPr>
+          <w:rFonts w:ascii="Consolas" w:hAnsi="Consolas"/>
+          <w:sz w:val="19"/>
+        </w:rPr>
+        <w:t>https://clauseguard.up.railway.app</w:t>
+      </w:r>
+      <w:r>
+        <w:t xml:space="preserve"> and the backend as a second service in Southeast Asia (Singapore), next to the Postgres region. Customers sign in with Supabase Auth (email and password, email confirmation required); the backend asks Supabase who owns the access token and derives the account id from it, and the three sandbox customers are three confirmed accounts mapped to their seeded policies. Audit events are chained in memory at once and stored by a single writer thread in ordered batches, each written only if the stored head still equals the batch's starting point; another writer moving the chain makes the queue re-chain on top of it, so the chain never forks, and a chat turn no longer waits for the database (from about 90 seconds to a few seconds per turn on a distant database).</w:t>
       </w:r>
     </w:p>
     <w:p>

</xml_diff>

<commit_message>
Technical documentation: competition structure, flowcharts, agent prompt table
</commit_message>
<xml_diff>
--- a/SUBMISSION/1_Technical_Documentation.docx
+++ b/SUBMISSION/1_Technical_Documentation.docx
@@ -46,24 +46,58 @@
       </w:r>
     </w:p>
     <w:p>
-      <w:pPr>
-        <w:pStyle w:val="Heading2"/>
-      </w:pPr>
       <w:r>
-        <w:rPr>
-          <w:color w:val="14213D"/>
-        </w:rPr>
-        <w:t>1.1 Topic and problem</w:t>
+        <w:t>ClauseGuard is an AI insurance assistant that helps customers understand their policies, check their coverage, calculate benefits and handle claims. One household can hold several policies, such as national health insurance (BPJS Kesehatan), an employer plan, a personal plan and an accident cover. The rules on waiting periods, filing deadlines, required documents and payment order are spread across long policy documents.</w:t>
       </w:r>
     </w:p>
     <w:p>
       <w:r>
-        <w:t>ClauseGuard addresses Topic D, the AI insurance assistant. Many households hold several policies at once, for example national health insurance (BPJS Kesehatan), an employer plan, a personal policy and an accident cover. The rules that decide a claim sit in long policy documents that people rarely read. These rules include filing deadlines, waiting periods, required documents and the order in which payers pay. Indonesia's financial services authority (OJK) reports that more than half of insurance complaints concern difficulty with claims. In the United States, about one in five in-network claims was denied in 2023 and fewer than 1% were appealed (KFF, 2025).</w:t>
+        <w:t>This creates five main risks:</w:t>
+      </w:r>
+    </w:p>
+    <w:p>
+      <w:pPr>
+        <w:pStyle w:val="ListNumber"/>
+      </w:pPr>
+      <w:r>
+        <w:t>A claim is filed after the deadline.</w:t>
+      </w:r>
+    </w:p>
+    <w:p>
+      <w:pPr>
+        <w:pStyle w:val="ListNumber"/>
+      </w:pPr>
+      <w:r>
+        <w:t>A claim is filed during a waiting period.</w:t>
+      </w:r>
+    </w:p>
+    <w:p>
+      <w:pPr>
+        <w:pStyle w:val="ListNumber"/>
+      </w:pPr>
+      <w:r>
+        <w:t>A claim is filed with a payer that does not match the payment order.</w:t>
+      </w:r>
+    </w:p>
+    <w:p>
+      <w:pPr>
+        <w:pStyle w:val="ListNumber"/>
+      </w:pPr>
+      <w:r>
+        <w:t>Overlapping benefits are not optimised, or benefits that can be stacked are not used.</w:t>
+      </w:r>
+    </w:p>
+    <w:p>
+      <w:pPr>
+        <w:pStyle w:val="ListNumber"/>
+      </w:pPr>
+      <w:r>
+        <w:t>A policy lapses because the premium was not paid during the grace period.</w:t>
       </w:r>
     </w:p>
     <w:p>
       <w:r>
-        <w:t>Five costly mistakes recur. A claim is filed after the deadline. A claim is filed inside a waiting period. The wrong payer is claimed first. The customer pays twice for overlapping cover or misses benefits that stack. A policy lapses during its grace period. All five can be computed from the customer's own documents.</w:t>
+        <w:t>ClauseGuard analyses the customer's own policies to help avoid these mistakes. According to KFF (2025), about one in five in-network health insurance claims in the United States was denied in 2023, and fewer than 1% of denied claims were appealed. In Indonesia, OJK (2023) reports that more than half of insurance complaints concern difficulty with claims.</w:t>
       </w:r>
     </w:p>
     <w:p>
@@ -74,7 +108,20 @@
         <w:rPr>
           <w:color w:val="14213D"/>
         </w:rPr>
-        <w:t>1.2 User personas</w:t>
+        <w:t>1.1 User personas</w:t>
+      </w:r>
+    </w:p>
+    <w:p>
+      <w:r>
+        <w:t>The project builds simulated data for three personas that represent common claim cases. Each persona can be tried directly in the demo with its own account.</w:t>
+      </w:r>
+    </w:p>
+    <w:p>
+      <w:r>
+        <w:rPr>
+          <w:b/>
+        </w:rPr>
+        <w:t>Table 1. ClauseGuard personas and demo accounts</w:t>
       </w:r>
     </w:p>
     <w:tbl>
@@ -145,7 +192,7 @@
                 <w:b/>
                 <w:sz w:val="18"/>
               </w:rPr>
-              <w:t>Policies held</w:t>
+              <w:t>Policies</w:t>
             </w:r>
           </w:p>
         </w:tc>
@@ -183,7 +230,7 @@
               <w:rPr>
                 <w:sz w:val="18"/>
               </w:rPr>
-              <w:t>Graduate student with a dengue hospital claim in progress</w:t>
+              <w:t>Graduate student handling a dengue hospital claim</w:t>
             </w:r>
           </w:p>
         </w:tc>
@@ -201,7 +248,7 @@
               <w:rPr>
                 <w:sz w:val="18"/>
               </w:rPr>
-              <w:t>Hospital cash plan (Sompo), term life with an overdue premium, critical illness, BPJS Kesehatan class 2</w:t>
+              <w:t>Sompo hospital cash plan, term life with an overdue premium, critical illness cover and BPJS Kesehatan class 2</w:t>
             </w:r>
           </w:p>
         </w:tc>
@@ -239,7 +286,7 @@
               <w:rPr>
                 <w:sz w:val="18"/>
               </w:rPr>
-              <w:t>Family of four, the head of the family is an employee</w:t>
+              <w:t>Family of four whose head works as a private-sector employee</w:t>
             </w:r>
           </w:p>
         </w:tc>
@@ -257,7 +304,7 @@
               <w:rPr>
                 <w:sz w:val="18"/>
               </w:rPr>
-              <w:t>Employer group health and life, a family hospital-cash rider, the wife's individual health plan, BPJS Kesehatan class 1</w:t>
+              <w:t>Employer group health and life, a family hospital cash rider, the wife's personal health plan and BPJS Kesehatan class 1</w:t>
             </w:r>
           </w:p>
         </w:tc>
@@ -313,7 +360,7 @@
               <w:rPr>
                 <w:sz w:val="18"/>
               </w:rPr>
-              <w:t>Personal accident, the platform's on-trip accident cover, BPJS Kesehatan class 3 with three months of arrears, Jasa Raharja</w:t>
+              <w:t>Personal accident cover, the platform's on-trip accident protection, BPJS Kesehatan class 3 with three months of arrears and Jasa Raharja</w:t>
             </w:r>
           </w:p>
         </w:tc>
@@ -322,7 +369,7 @@
     <w:p/>
     <w:p>
       <w:r>
-        <w:t>The three personas and their policies are synthetic. Their policy wording is modelled on public insurer documents. Real customers can also sign up, upload their own policy PDF and ask about it right away.</w:t>
+        <w:t>All persona data is synthetic. The policy wording is modelled on public insurer documents. New users can also sign up, upload their own policy PDF and ask about it right away.</w:t>
       </w:r>
     </w:p>
     <w:p>
@@ -333,102 +380,20 @@
         <w:rPr>
           <w:color w:val="14213D"/>
         </w:rPr>
-        <w:t>1.3 Financial tasks the agent completes</w:t>
+        <w:t>1.2 Features</w:t>
       </w:r>
     </w:p>
     <w:p>
-      <w:pPr>
-        <w:pStyle w:val="ListNumber"/>
-      </w:pPr>
+      <w:r>
+        <w:t>ClauseGuard has three core features and three supporting features.</w:t>
+      </w:r>
+    </w:p>
+    <w:p>
       <w:r>
         <w:rPr>
           <w:b/>
         </w:rPr>
-        <w:t>Check coverage.</w:t>
-      </w:r>
-      <w:r>
-        <w:t xml:space="preserve"> For each policy the agent decides whether the event is covered, the indicative benefit and the filing deadline, with the deciding clause quoted.</w:t>
-      </w:r>
-    </w:p>
-    <w:p>
-      <w:pPr>
-        <w:pStyle w:val="ListNumber"/>
-      </w:pPr>
-      <w:r>
-        <w:rPr>
-          <w:b/>
-        </w:rPr>
-        <w:t>Order the payers.</w:t>
-      </w:r>
-      <w:r>
-        <w:t xml:space="preserve"> For one hospital bill the agent computes which policy pays first and how much each one pays.</w:t>
-      </w:r>
-    </w:p>
-    <w:p>
-      <w:pPr>
-        <w:pStyle w:val="ListNumber"/>
-      </w:pPr>
-      <w:r>
-        <w:rPr>
-          <w:b/>
-        </w:rPr>
-        <w:t>Prepare and file the claim.</w:t>
-      </w:r>
-      <w:r>
-        <w:t xml:space="preserve"> The agent reads the hospital documents, matches them to the insurer's list of required documents, fills in that insurer's claim form and files it after the customer taps Confirm.</w:t>
-      </w:r>
-    </w:p>
-    <w:p>
-      <w:pPr>
-        <w:pStyle w:val="ListNumber"/>
-      </w:pPr>
-      <w:r>
-        <w:rPr>
-          <w:b/>
-        </w:rPr>
-        <w:t>Follow up on the decision.</w:t>
-      </w:r>
-      <w:r>
-        <w:t xml:space="preserve"> The agent relays the insurer's decision, explains what can be fixed and checks whether a rejection has grounds for appeal.</w:t>
-      </w:r>
-    </w:p>
-    <w:p>
-      <w:pPr>
-        <w:pStyle w:val="ListNumber"/>
-      </w:pPr>
-      <w:r>
-        <w:rPr>
-          <w:b/>
-        </w:rPr>
-        <w:t>Watch deadlines and policy status.</w:t>
-      </w:r>
-      <w:r>
-        <w:t xml:space="preserve"> The agent warns before a filing deadline or a premium grace period runs out.</w:t>
-      </w:r>
-    </w:p>
-    <w:p>
-      <w:pPr>
-        <w:pStyle w:val="ListNumber"/>
-      </w:pPr>
-      <w:r>
-        <w:rPr>
-          <w:b/>
-        </w:rPr>
-        <w:t>Close coverage gaps.</w:t>
-      </w:r>
-      <w:r>
-        <w:t xml:space="preserve"> The agent recommends the plans that close the largest gap within a monthly budget.</w:t>
-      </w:r>
-    </w:p>
-    <w:p>
-      <w:pPr>
-        <w:pStyle w:val="Heading2"/>
-      </w:pPr>
-      <w:r>
-        <w:rPr>
-          <w:color w:val="14213D"/>
-        </w:rPr>
-        <w:t>1.4 Success metrics</w:t>
+        <w:t>Table 2. Core features</w:t>
       </w:r>
     </w:p>
     <w:tbl>
@@ -459,7 +424,7 @@
                 <w:b/>
                 <w:sz w:val="18"/>
               </w:rPr>
-              <w:t>Metric</w:t>
+              <w:t>Feature</w:t>
             </w:r>
           </w:p>
         </w:tc>
@@ -479,7 +444,7 @@
                 <w:b/>
                 <w:sz w:val="18"/>
               </w:rPr>
-              <w:t>Definition</w:t>
+              <w:t>Purpose</w:t>
             </w:r>
           </w:p>
         </w:tc>
@@ -499,7 +464,7 @@
                 <w:b/>
                 <w:sz w:val="18"/>
               </w:rPr>
-              <w:t>Result</w:t>
+              <w:t>Financial task completed</w:t>
             </w:r>
           </w:p>
         </w:tc>
@@ -519,7 +484,7 @@
               <w:rPr>
                 <w:sz w:val="18"/>
               </w:rPr>
-              <w:t>Scripted task completion</w:t>
+              <w:t>ClauseLens</w:t>
             </w:r>
           </w:p>
         </w:tc>
@@ -537,7 +502,7 @@
               <w:rPr>
                 <w:sz w:val="18"/>
               </w:rPr>
-              <w:t>Share of claim tasks that pass automatic checks on verdict, amount, deadline, denial code and actions</w:t>
+              <w:t>Understands the customer's cover</w:t>
             </w:r>
           </w:p>
         </w:tc>
@@ -555,7 +520,7 @@
               <w:rPr>
                 <w:sz w:val="18"/>
               </w:rPr>
-              <w:t>33 of 33 (100%)</w:t>
+              <w:t>Decides whether an event is covered, how much is paid, the filing deadline and which policy pays first, with the clause quoted</w:t>
             </w:r>
           </w:p>
         </w:tc>
@@ -575,7 +540,7 @@
               <w:rPr>
                 <w:sz w:val="18"/>
               </w:rPr>
-              <w:t>Coverage accuracy</w:t>
+              <w:t>ClaimFlow</w:t>
             </w:r>
           </w:p>
         </w:tc>
@@ -593,7 +558,7 @@
               <w:rPr>
                 <w:sz w:val="18"/>
               </w:rPr>
-              <w:t>Correct verdicts on a public insurance benchmark</w:t>
+              <w:t>Handles the customer's claim</w:t>
             </w:r>
           </w:p>
         </w:tc>
@@ -611,7 +576,7 @@
               <w:rPr>
                 <w:sz w:val="18"/>
               </w:rPr>
-              <w:t>84.6% (n = 390)</w:t>
+              <w:t>Reads hospital documents, matches them to the required documents, fills in the insurer's own claim form, files after confirmation and relays the insurer's decision</w:t>
             </w:r>
           </w:p>
         </w:tc>
@@ -631,7 +596,7 @@
               <w:rPr>
                 <w:sz w:val="18"/>
               </w:rPr>
-              <w:t>Invented denials</w:t>
+              <w:t>TrustLock</w:t>
             </w:r>
           </w:p>
         </w:tc>
@@ -649,7 +614,7 @@
               <w:rPr>
                 <w:sz w:val="18"/>
               </w:rPr>
-              <w:t>Denials returned where no clause applies</w:t>
+              <w:t>Keeps the customer in control</w:t>
             </w:r>
           </w:p>
         </w:tc>
@@ -667,7 +632,287 @@
               <w:rPr>
                 <w:sz w:val="18"/>
               </w:rPr>
-              <w:t>1.4%</w:t>
+              <w:t>Limits every agent action with four permission tiers, a single-use confirmation and an audit log</w:t>
+            </w:r>
+          </w:p>
+        </w:tc>
+      </w:tr>
+    </w:tbl>
+    <w:p/>
+    <w:p>
+      <w:r>
+        <w:rPr>
+          <w:b/>
+        </w:rPr>
+        <w:t>Table 3. Supporting features</w:t>
+      </w:r>
+    </w:p>
+    <w:tbl>
+      <w:tblPr>
+        <w:tblStyle w:val="TableGrid"/>
+        <w:tblW w:type="auto" w:w="0"/>
+        <w:tblLook w:firstColumn="1" w:firstRow="1" w:lastColumn="0" w:lastRow="0" w:noHBand="0" w:noVBand="1" w:val="04A0"/>
+      </w:tblPr>
+      <w:tblGrid>
+        <w:gridCol w:w="4320"/>
+        <w:gridCol w:w="4320"/>
+      </w:tblGrid>
+      <w:tr>
+        <w:tc>
+          <w:tcPr>
+            <w:tcW w:type="dxa" w:w="4320"/>
+          </w:tcPr>
+          <w:p>
+            <w:r>
+              <w:rPr>
+                <w:b/>
+                <w:sz w:val="18"/>
+              </w:rPr>
+            </w:r>
+            <w:r>
+              <w:rPr>
+                <w:b/>
+                <w:sz w:val="18"/>
+              </w:rPr>
+              <w:t>Feature</w:t>
+            </w:r>
+          </w:p>
+        </w:tc>
+        <w:tc>
+          <w:tcPr>
+            <w:tcW w:type="dxa" w:w="4320"/>
+          </w:tcPr>
+          <w:p>
+            <w:r>
+              <w:rPr>
+                <w:b/>
+                <w:sz w:val="18"/>
+              </w:rPr>
+            </w:r>
+            <w:r>
+              <w:rPr>
+                <w:b/>
+                <w:sz w:val="18"/>
+              </w:rPr>
+              <w:t>Purpose</w:t>
+            </w:r>
+          </w:p>
+        </w:tc>
+      </w:tr>
+      <w:tr>
+        <w:tc>
+          <w:tcPr>
+            <w:tcW w:type="dxa" w:w="4320"/>
+          </w:tcPr>
+          <w:p>
+            <w:r>
+              <w:rPr>
+                <w:sz w:val="18"/>
+              </w:rPr>
+            </w:r>
+            <w:r>
+              <w:rPr>
+                <w:sz w:val="18"/>
+              </w:rPr>
+              <w:t>Claim Simulator</w:t>
+            </w:r>
+          </w:p>
+        </w:tc>
+        <w:tc>
+          <w:tcPr>
+            <w:tcW w:type="dxa" w:w="4320"/>
+          </w:tcPr>
+          <w:p>
+            <w:r>
+              <w:rPr>
+                <w:sz w:val="18"/>
+              </w:rPr>
+            </w:r>
+            <w:r>
+              <w:rPr>
+                <w:sz w:val="18"/>
+              </w:rPr>
+              <w:t>Answers what-ifs, for example "if I had stayed five days", without affecting a real claim</w:t>
+            </w:r>
+          </w:p>
+        </w:tc>
+      </w:tr>
+      <w:tr>
+        <w:tc>
+          <w:tcPr>
+            <w:tcW w:type="dxa" w:w="4320"/>
+          </w:tcPr>
+          <w:p>
+            <w:r>
+              <w:rPr>
+                <w:sz w:val="18"/>
+              </w:rPr>
+            </w:r>
+            <w:r>
+              <w:rPr>
+                <w:sz w:val="18"/>
+              </w:rPr>
+              <w:t>Deadline Tracker</w:t>
+            </w:r>
+          </w:p>
+        </w:tc>
+        <w:tc>
+          <w:tcPr>
+            <w:tcW w:type="dxa" w:w="4320"/>
+          </w:tcPr>
+          <w:p>
+            <w:r>
+              <w:rPr>
+                <w:sz w:val="18"/>
+              </w:rPr>
+            </w:r>
+            <w:r>
+              <w:rPr>
+                <w:sz w:val="18"/>
+              </w:rPr>
+              <w:t>Warns before a claim deadline or a premium grace period runs out</w:t>
+            </w:r>
+          </w:p>
+        </w:tc>
+      </w:tr>
+      <w:tr>
+        <w:tc>
+          <w:tcPr>
+            <w:tcW w:type="dxa" w:w="4320"/>
+          </w:tcPr>
+          <w:p>
+            <w:r>
+              <w:rPr>
+                <w:sz w:val="18"/>
+              </w:rPr>
+            </w:r>
+            <w:r>
+              <w:rPr>
+                <w:sz w:val="18"/>
+              </w:rPr>
+              <w:t>PDF Export</w:t>
+            </w:r>
+          </w:p>
+        </w:tc>
+        <w:tc>
+          <w:tcPr>
+            <w:tcW w:type="dxa" w:w="4320"/>
+          </w:tcPr>
+          <w:p>
+            <w:r>
+              <w:rPr>
+                <w:sz w:val="18"/>
+              </w:rPr>
+            </w:r>
+            <w:r>
+              <w:rPr>
+                <w:sz w:val="18"/>
+              </w:rPr>
+              <w:t>Saves the answer, the clause evidence and the claim form as a document</w:t>
+            </w:r>
+          </w:p>
+        </w:tc>
+      </w:tr>
+    </w:tbl>
+    <w:p/>
+    <w:p>
+      <w:r>
+        <w:t>Besides these features, ClauseGuard has base capabilities that support all of them: uploading one's own policy, two languages (Indonesian and English), accounts with chat history, a sandbox insurer with a claims desk, a "How was this decided" panel on every answer, and the audit log.</w:t>
+      </w:r>
+    </w:p>
+    <w:p>
+      <w:pPr>
+        <w:pStyle w:val="Heading2"/>
+      </w:pPr>
+      <w:r>
+        <w:rPr>
+          <w:color w:val="14213D"/>
+        </w:rPr>
+        <w:t>1.3 Success metrics</w:t>
+      </w:r>
+    </w:p>
+    <w:p>
+      <w:r>
+        <w:t>Task success is measured by automatic checks. No model judges the results.</w:t>
+      </w:r>
+    </w:p>
+    <w:p>
+      <w:r>
+        <w:rPr>
+          <w:b/>
+        </w:rPr>
+        <w:t>Table 4. Success metrics and results</w:t>
+      </w:r>
+    </w:p>
+    <w:tbl>
+      <w:tblPr>
+        <w:tblStyle w:val="TableGrid"/>
+        <w:tblW w:type="auto" w:w="0"/>
+        <w:tblLook w:firstColumn="1" w:firstRow="1" w:lastColumn="0" w:lastRow="0" w:noHBand="0" w:noVBand="1" w:val="04A0"/>
+      </w:tblPr>
+      <w:tblGrid>
+        <w:gridCol w:w="2880"/>
+        <w:gridCol w:w="2880"/>
+        <w:gridCol w:w="2880"/>
+      </w:tblGrid>
+      <w:tr>
+        <w:tc>
+          <w:tcPr>
+            <w:tcW w:type="dxa" w:w="2880"/>
+          </w:tcPr>
+          <w:p>
+            <w:r>
+              <w:rPr>
+                <w:b/>
+                <w:sz w:val="18"/>
+              </w:rPr>
+            </w:r>
+            <w:r>
+              <w:rPr>
+                <w:b/>
+                <w:sz w:val="18"/>
+              </w:rPr>
+              <w:t>Metric</w:t>
+            </w:r>
+          </w:p>
+        </w:tc>
+        <w:tc>
+          <w:tcPr>
+            <w:tcW w:type="dxa" w:w="2880"/>
+          </w:tcPr>
+          <w:p>
+            <w:r>
+              <w:rPr>
+                <w:b/>
+                <w:sz w:val="18"/>
+              </w:rPr>
+            </w:r>
+            <w:r>
+              <w:rPr>
+                <w:b/>
+                <w:sz w:val="18"/>
+              </w:rPr>
+              <w:t>How it is measured</w:t>
+            </w:r>
+          </w:p>
+        </w:tc>
+        <w:tc>
+          <w:tcPr>
+            <w:tcW w:type="dxa" w:w="2880"/>
+          </w:tcPr>
+          <w:p>
+            <w:r>
+              <w:rPr>
+                <w:b/>
+                <w:sz w:val="18"/>
+              </w:rPr>
+            </w:r>
+            <w:r>
+              <w:rPr>
+                <w:b/>
+                <w:sz w:val="18"/>
+              </w:rPr>
+              <w:t>Result</w:t>
             </w:r>
           </w:p>
         </w:tc>
@@ -687,7 +932,7 @@
               <w:rPr>
                 <w:sz w:val="18"/>
               </w:rPr>
-              <w:t>Clarification precision</w:t>
+              <w:t>Claim task completion</w:t>
             </w:r>
           </w:p>
         </w:tc>
@@ -705,7 +950,7 @@
               <w:rPr>
                 <w:sz w:val="18"/>
               </w:rPr>
-              <w:t>Asks when the answer would change and stays silent otherwise</w:t>
+              <w:t>Scripted tasks that pass checks on verdict, amount, deadline, denial code and actions</w:t>
             </w:r>
           </w:p>
         </w:tc>
@@ -723,7 +968,7 @@
               <w:rPr>
                 <w:sz w:val="18"/>
               </w:rPr>
-              <w:t>87% and 100%</w:t>
+              <w:t>33 of 33 (100%)</w:t>
             </w:r>
           </w:p>
         </w:tc>
@@ -743,7 +988,7 @@
               <w:rPr>
                 <w:sz w:val="18"/>
               </w:rPr>
-              <w:t>End-to-end claim</w:t>
+              <w:t>Coverage accuracy</w:t>
             </w:r>
           </w:p>
         </w:tc>
@@ -761,7 +1006,7 @@
               <w:rPr>
                 <w:sz w:val="18"/>
               </w:rPr>
-              <w:t>Documents, form, confirmation, desk decision and the decision back in the chat</w:t>
+              <w:t>Correct verdicts on a public insurance benchmark</w:t>
             </w:r>
           </w:p>
         </w:tc>
@@ -779,7 +1024,175 @@
               <w:rPr>
                 <w:sz w:val="18"/>
               </w:rPr>
-              <w:t>Completed and recorded with audit sequence numbers</w:t>
+              <w:t>84.6% of 390 labels</w:t>
+            </w:r>
+          </w:p>
+        </w:tc>
+      </w:tr>
+      <w:tr>
+        <w:tc>
+          <w:tcPr>
+            <w:tcW w:type="dxa" w:w="2880"/>
+          </w:tcPr>
+          <w:p>
+            <w:r>
+              <w:rPr>
+                <w:sz w:val="18"/>
+              </w:rPr>
+            </w:r>
+            <w:r>
+              <w:rPr>
+                <w:sz w:val="18"/>
+              </w:rPr>
+              <w:t>Invented denials</w:t>
+            </w:r>
+          </w:p>
+        </w:tc>
+        <w:tc>
+          <w:tcPr>
+            <w:tcW w:type="dxa" w:w="2880"/>
+          </w:tcPr>
+          <w:p>
+            <w:r>
+              <w:rPr>
+                <w:sz w:val="18"/>
+              </w:rPr>
+            </w:r>
+            <w:r>
+              <w:rPr>
+                <w:sz w:val="18"/>
+              </w:rPr>
+              <w:t>Denials returned where no clause applies</w:t>
+            </w:r>
+          </w:p>
+        </w:tc>
+        <w:tc>
+          <w:tcPr>
+            <w:tcW w:type="dxa" w:w="2880"/>
+          </w:tcPr>
+          <w:p>
+            <w:r>
+              <w:rPr>
+                <w:sz w:val="18"/>
+              </w:rPr>
+            </w:r>
+            <w:r>
+              <w:rPr>
+                <w:sz w:val="18"/>
+              </w:rPr>
+              <w:t>1.4%</w:t>
+            </w:r>
+          </w:p>
+        </w:tc>
+      </w:tr>
+      <w:tr>
+        <w:tc>
+          <w:tcPr>
+            <w:tcW w:type="dxa" w:w="2880"/>
+          </w:tcPr>
+          <w:p>
+            <w:r>
+              <w:rPr>
+                <w:sz w:val="18"/>
+              </w:rPr>
+            </w:r>
+            <w:r>
+              <w:rPr>
+                <w:sz w:val="18"/>
+              </w:rPr>
+              <w:t>Question precision</w:t>
+            </w:r>
+          </w:p>
+        </w:tc>
+        <w:tc>
+          <w:tcPr>
+            <w:tcW w:type="dxa" w:w="2880"/>
+          </w:tcPr>
+          <w:p>
+            <w:r>
+              <w:rPr>
+                <w:sz w:val="18"/>
+              </w:rPr>
+            </w:r>
+            <w:r>
+              <w:rPr>
+                <w:sz w:val="18"/>
+              </w:rPr>
+              <w:t>Asks when the answer would change and stays silent otherwise</w:t>
+            </w:r>
+          </w:p>
+        </w:tc>
+        <w:tc>
+          <w:tcPr>
+            <w:tcW w:type="dxa" w:w="2880"/>
+          </w:tcPr>
+          <w:p>
+            <w:r>
+              <w:rPr>
+                <w:sz w:val="18"/>
+              </w:rPr>
+            </w:r>
+            <w:r>
+              <w:rPr>
+                <w:sz w:val="18"/>
+              </w:rPr>
+              <w:t>87% and 100%</w:t>
+            </w:r>
+          </w:p>
+        </w:tc>
+      </w:tr>
+      <w:tr>
+        <w:tc>
+          <w:tcPr>
+            <w:tcW w:type="dxa" w:w="2880"/>
+          </w:tcPr>
+          <w:p>
+            <w:r>
+              <w:rPr>
+                <w:sz w:val="18"/>
+              </w:rPr>
+            </w:r>
+            <w:r>
+              <w:rPr>
+                <w:sz w:val="18"/>
+              </w:rPr>
+              <w:t>End-to-end claim</w:t>
+            </w:r>
+          </w:p>
+        </w:tc>
+        <w:tc>
+          <w:tcPr>
+            <w:tcW w:type="dxa" w:w="2880"/>
+          </w:tcPr>
+          <w:p>
+            <w:r>
+              <w:rPr>
+                <w:sz w:val="18"/>
+              </w:rPr>
+            </w:r>
+            <w:r>
+              <w:rPr>
+                <w:sz w:val="18"/>
+              </w:rPr>
+              <w:t>From documents to the insurer's decision back in the chat</w:t>
+            </w:r>
+          </w:p>
+        </w:tc>
+        <w:tc>
+          <w:tcPr>
+            <w:tcW w:type="dxa" w:w="2880"/>
+          </w:tcPr>
+          <w:p>
+            <w:r>
+              <w:rPr>
+                <w:sz w:val="18"/>
+              </w:rPr>
+            </w:r>
+            <w:r>
+              <w:rPr>
+                <w:sz w:val="18"/>
+              </w:rPr>
+              <w:t>Completed and recorded in the audit log</w:t>
             </w:r>
           </w:p>
         </w:tc>
@@ -917,7 +1330,12 @@
         <w:rPr>
           <w:color w:val="14213D"/>
         </w:rPr>
-        <w:t>2.1 Component diagram</w:t>
+        <w:t>2.1 System components</w:t>
+      </w:r>
+    </w:p>
+    <w:p>
+      <w:r>
+        <w:t>Figure 1 shows the components of ClauseGuard. AI agents understand and explain. The rules engine decides. The Guardian enforces permissions. Every step is recorded in the audit log.</w:t>
       </w:r>
     </w:p>
     <w:p>
@@ -968,7 +1386,15 @@
           <w:i/>
           <w:sz w:val="18"/>
         </w:rPr>
-        <w:t>Figure 1. ClauseGuard architecture. AI agents understand and explain, the rules engine decides, the guardian enforces permissions and every step is recorded.</w:t>
+        <w:t>Figure 1. ClauseGuard component architecture</w:t>
+      </w:r>
+    </w:p>
+    <w:p>
+      <w:r>
+        <w:rPr>
+          <w:b/>
+        </w:rPr>
+        <w:t>Table 5. Role of each component</w:t>
       </w:r>
     </w:p>
     <w:tbl>
@@ -1056,7 +1482,7 @@
               <w:rPr>
                 <w:sz w:val="18"/>
               </w:rPr>
-              <w:t>A web app for customers (chat, verdict cards, claim form, document upload) and a claims desk for the insurer's staff</w:t>
+              <w:t>The customer web app (chat, verdict cards, claim form, document upload) and the claims desk for insurer staff</w:t>
             </w:r>
           </w:p>
         </w:tc>
@@ -1094,7 +1520,7 @@
               <w:rPr>
                 <w:sz w:val="18"/>
               </w:rPr>
-              <w:t>The agent loop that runs planning, the permission check, tool calls, fact binding, the rules engine and reply writing for every turn</w:t>
+              <w:t>The agent loop that runs planning, the permission check, tool calls, the rules engine and reply writing in every turn</w:t>
             </w:r>
           </w:p>
         </w:tc>
@@ -1132,7 +1558,7 @@
               <w:rPr>
                 <w:sz w:val="18"/>
               </w:rPr>
-              <w:t>Google Gemini, used to understand messages, read documents and word replies</w:t>
+              <w:t>Google Gemini to understand messages, read documents and word replies</w:t>
             </w:r>
           </w:p>
         </w:tc>
@@ -1170,7 +1596,7 @@
               <w:rPr>
                 <w:sz w:val="18"/>
               </w:rPr>
-              <w:t>Conversation Agent, Fact Agent, Document Reader Agent, Explainer Agent and Watchdog Agent</w:t>
+              <w:t>Seven agents with narrow tasks, described in section 3.1</w:t>
             </w:r>
           </w:p>
         </w:tc>
@@ -1208,7 +1634,7 @@
               <w:rPr>
                 <w:sz w:val="18"/>
               </w:rPr>
-              <w:t>19 permission-tiered tools (read policies, check coverage, draft a claim, file a claim, attach a document, file an appeal and others) that call the sandbox insurer API</w:t>
+              <w:t>19 permission-tiered tools that call the sandbox insurer API</w:t>
             </w:r>
           </w:p>
         </w:tc>
@@ -1284,7 +1710,7 @@
               <w:rPr>
                 <w:sz w:val="18"/>
               </w:rPr>
-              <w:t>The permission enforcement point in code that checks every tool call</w:t>
+              <w:t>The permission enforcement point that checks every tool call</w:t>
             </w:r>
           </w:p>
         </w:tc>
@@ -1322,7 +1748,7 @@
               <w:rPr>
                 <w:sz w:val="18"/>
               </w:rPr>
-              <w:t>Postgres on Supabase for the audit chain, chat history, claims and tickets. A sandbox database for policies and customers</w:t>
+              <w:t>Postgres on Supabase for the audit log, chat history, claims and tickets</w:t>
             </w:r>
           </w:p>
         </w:tc>
@@ -1360,7 +1786,7 @@
               <w:rPr>
                 <w:sz w:val="18"/>
               </w:rPr>
-              <w:t>A simulated insurer with its own claims desk, where a person decides the claims the agent files</w:t>
+              <w:t>A simulated insurer with a claims desk where staff decide claims</w:t>
             </w:r>
           </w:p>
         </w:tc>
@@ -1375,47 +1801,63 @@
         <w:rPr>
           <w:color w:val="14213D"/>
         </w:rPr>
-        <w:t>2.2 Data flow</w:t>
+        <w:t>2.2 Claim flow</w:t>
+      </w:r>
+    </w:p>
+    <w:p>
+      <w:r>
+        <w:t>Figure 2 shows one claim from the first question to the insurer's decision. The box colours show who acts at each step.</w:t>
       </w:r>
     </w:p>
     <w:p>
       <w:pPr>
-        <w:pStyle w:val="ListNumber"/>
+        <w:jc w:val="center"/>
       </w:pPr>
       <w:r>
-        <w:t>The customer sends a message or a file through the web app.</w:t>
+        <w:drawing>
+          <wp:inline xmlns:a="http://schemas.openxmlformats.org/drawingml/2006/main" xmlns:pic="http://schemas.openxmlformats.org/drawingml/2006/picture">
+            <wp:extent cx="3291840" cy="8937025"/>
+            <wp:docPr id="2" name="Picture 2"/>
+            <wp:cNvGraphicFramePr>
+              <a:graphicFrameLocks noChangeAspect="1"/>
+            </wp:cNvGraphicFramePr>
+            <a:graphic>
+              <a:graphicData uri="http://schemas.openxmlformats.org/drawingml/2006/picture">
+                <pic:pic>
+                  <pic:nvPicPr>
+                    <pic:cNvPr id="0" name="flow_claim_en.png"/>
+                    <pic:cNvPicPr/>
+                  </pic:nvPicPr>
+                  <pic:blipFill>
+                    <a:blip r:embed="rId10"/>
+                    <a:stretch>
+                      <a:fillRect/>
+                    </a:stretch>
+                  </pic:blipFill>
+                  <pic:spPr>
+                    <a:xfrm>
+                      <a:off x="0" y="0"/>
+                      <a:ext cx="3291840" cy="8937025"/>
+                    </a:xfrm>
+                    <a:prstGeom prst="rect"/>
+                  </pic:spPr>
+                </pic:pic>
+              </a:graphicData>
+            </a:graphic>
+          </wp:inline>
+        </w:drawing>
       </w:r>
     </w:p>
     <w:p>
       <w:pPr>
-        <w:pStyle w:val="ListNumber"/>
+        <w:jc w:val="center"/>
       </w:pPr>
       <w:r>
-        <w:t>Files pass a hidden-text scanner. Personal data such as national ID numbers, bank accounts and phone numbers is removed locally.</w:t>
-      </w:r>
-    </w:p>
-    <w:p>
-      <w:pPr>
-        <w:pStyle w:val="ListNumber"/>
-      </w:pPr>
-      <w:r>
-        <w:t>The Document Reader Agent turns the file into a typed record, for example document type, dates, bill total and diagnosis.</w:t>
-      </w:r>
-    </w:p>
-    <w:p>
-      <w:pPr>
-        <w:pStyle w:val="ListNumber"/>
-      </w:pPr>
-      <w:r>
-        <w:t>The customer's policies are available as typed rules, and each rule links to its sentence in the policy.</w:t>
-      </w:r>
-    </w:p>
-    <w:p>
-      <w:pPr>
-        <w:pStyle w:val="ListNumber"/>
-      </w:pPr>
-      <w:r>
-        <w:t>Engine results and replies are kept in the customer's session. Chat history, claims and the audit log are stored in Postgres per account.</w:t>
+        <w:rPr>
+          <w:i/>
+          <w:sz w:val="18"/>
+        </w:rPr>
+        <w:t>Figure 2. Claim flow from question to decision</w:t>
       </w:r>
     </w:p>
     <w:p>
@@ -1426,63 +1868,63 @@
         <w:rPr>
           <w:color w:val="14213D"/>
         </w:rPr>
-        <w:t>2.3 Decision flow</w:t>
+        <w:t>2.3 Decision flow in one turn</w:t>
+      </w:r>
+    </w:p>
+    <w:p>
+      <w:r>
+        <w:t>Figure 3 shows the steps that run every time the customer sends a message. Safety rules are decided by code before the model reads the intent. The verdict is always computed by the rules engine.</w:t>
       </w:r>
     </w:p>
     <w:p>
       <w:pPr>
-        <w:pStyle w:val="ListNumber"/>
+        <w:jc w:val="center"/>
       </w:pPr>
       <w:r>
-        <w:t>The Conversation Agent decides how the message relates to the conversation: a new situation, a correction, an answer to a question, a what-if or a general question.</w:t>
+        <w:drawing>
+          <wp:inline xmlns:a="http://schemas.openxmlformats.org/drawingml/2006/main" xmlns:pic="http://schemas.openxmlformats.org/drawingml/2006/picture">
+            <wp:extent cx="3474720" cy="7225211"/>
+            <wp:docPr id="3" name="Picture 3"/>
+            <wp:cNvGraphicFramePr>
+              <a:graphicFrameLocks noChangeAspect="1"/>
+            </wp:cNvGraphicFramePr>
+            <a:graphic>
+              <a:graphicData uri="http://schemas.openxmlformats.org/drawingml/2006/picture">
+                <pic:pic>
+                  <pic:nvPicPr>
+                    <pic:cNvPr id="0" name="flow_turn_en.png"/>
+                    <pic:cNvPicPr/>
+                  </pic:nvPicPr>
+                  <pic:blipFill>
+                    <a:blip r:embed="rId11"/>
+                    <a:stretch>
+                      <a:fillRect/>
+                    </a:stretch>
+                  </pic:blipFill>
+                  <pic:spPr>
+                    <a:xfrm>
+                      <a:off x="0" y="0"/>
+                      <a:ext cx="3474720" cy="7225211"/>
+                    </a:xfrm>
+                    <a:prstGeom prst="rect"/>
+                  </pic:spPr>
+                </pic:pic>
+              </a:graphicData>
+            </a:graphic>
+          </wp:inline>
+        </w:drawing>
       </w:r>
     </w:p>
     <w:p>
       <w:pPr>
-        <w:pStyle w:val="ListNumber"/>
+        <w:jc w:val="center"/>
       </w:pPr>
       <w:r>
-        <w:t>The planner decides the intent and the tools needed. Safety classifications are decided first by code.</w:t>
-      </w:r>
-    </w:p>
-    <w:p>
-      <w:pPr>
-        <w:pStyle w:val="ListNumber"/>
-      </w:pPr>
-      <w:r>
-        <w:t>The Guardian checks every tool against its permission tier and the autonomy mode the customer chose.</w:t>
-      </w:r>
-    </w:p>
-    <w:p>
-      <w:pPr>
-        <w:pStyle w:val="ListNumber"/>
-      </w:pPr>
-      <w:r>
-        <w:t>The Fact Agent turns sentences into typed facts. The rules engine computes the verdict for every policy.</w:t>
-      </w:r>
-    </w:p>
-    <w:p>
-      <w:pPr>
-        <w:pStyle w:val="ListNumber"/>
-      </w:pPr>
-      <w:r>
-        <w:t>If one unknown fact would change the verdict, the agent asks for that fact only.</w:t>
-      </w:r>
-    </w:p>
-    <w:p>
-      <w:pPr>
-        <w:pStyle w:val="ListNumber"/>
-      </w:pPr>
-      <w:r>
-        <w:t>The Explainer Agent writes the reply. Every amount, date and identifier is checked against the engine's results before it is shown.</w:t>
-      </w:r>
-    </w:p>
-    <w:p>
-      <w:pPr>
-        <w:pStyle w:val="ListNumber"/>
-      </w:pPr>
-      <w:r>
-        <w:t>Any action that sends something to the insurer waits for the customer's confirmation. A person at the insurer decides the claim, and the decision comes back to the chat.</w:t>
+        <w:rPr>
+          <w:i/>
+          <w:sz w:val="18"/>
+        </w:rPr>
+        <w:t>Figure 3. Decision flow in one conversation turn</w:t>
       </w:r>
     </w:p>
     <w:p>
@@ -1493,7 +1935,20 @@
         <w:rPr>
           <w:color w:val="14213D"/>
         </w:rPr>
-        <w:t>2.4 Technology stack, deployment and rationale</w:t>
+        <w:t>2.4 Technology stack and deployment</w:t>
+      </w:r>
+    </w:p>
+    <w:p>
+      <w:r>
+        <w:t>Each technology was chosen because it supports structured, safe and checkable output.</w:t>
+      </w:r>
+    </w:p>
+    <w:p>
+      <w:r>
+        <w:rPr>
+          <w:b/>
+        </w:rPr>
+        <w:t>Table 6. Technology stack and rationale</w:t>
       </w:r>
     </w:p>
     <w:tbl>
@@ -1620,7 +2075,7 @@
               <w:rPr>
                 <w:sz w:val="18"/>
               </w:rPr>
-              <w:t>Strict typed schemas for policy rules, facts and model output. Pydantic rejects model output that does not fit the schema</w:t>
+              <w:t>Strict typed schemas for policy rules, facts and model output</w:t>
             </w:r>
           </w:p>
         </w:tc>
@@ -1732,7 +2187,7 @@
               <w:rPr>
                 <w:sz w:val="18"/>
               </w:rPr>
-              <w:t>Plan selection as an integer programme with optimal, checkable results</w:t>
+              <w:t>Plan selection with optimal results that can be checked</w:t>
             </w:r>
           </w:p>
         </w:tc>
@@ -1788,7 +2243,7 @@
               <w:rPr>
                 <w:sz w:val="18"/>
               </w:rPr>
-              <w:t>A chat interface with interactive cards, one code base for customers and the insurer's desk</w:t>
+              <w:t>A chat interface with interactive cards for customers and the insurer's desk</w:t>
             </w:r>
           </w:p>
         </w:tc>
@@ -1844,7 +2299,7 @@
               <w:rPr>
                 <w:sz w:val="18"/>
               </w:rPr>
-              <w:t>Email sign-in with confirmation, row-level security, and an audit chain that survives server restarts</w:t>
+              <w:t>Confirmed email sign-in, row-level security and a persistent audit log</w:t>
             </w:r>
           </w:p>
         </w:tc>
@@ -1900,7 +2355,7 @@
               <w:rPr>
                 <w:sz w:val="18"/>
               </w:rPr>
-              <w:t>Web and API as two services close to the database, deployed automatically from the repository</w:t>
+              <w:t>Separate web and API services close to the database, updated automatically from the repository</w:t>
             </w:r>
           </w:p>
         </w:tc>
@@ -1926,12 +2381,933 @@
         <w:rPr>
           <w:color w:val="14213D"/>
         </w:rPr>
-        <w:t>3.1 Planning</w:t>
+        <w:t>3.1 AI agents and prompt design</w:t>
       </w:r>
     </w:p>
     <w:p>
       <w:r>
-        <w:t>The planner has two layers. The first layer is code rules for safety-relevant classifications, such as misrepresentation requests, access to another customer's data, account changes and requests to reveal system internals. The model cannot change these classifications. The second layer is a model that reads the message in the context of the conversation. It decides the intent, the read-only tools needed and the topic of the question, for example documents, deadline, amount or claim progress. A request to act is accepted only when the model reads a clear request or an accepted offer from the agent.</w:t>
+        <w:t>ClauseGuard uses seven AI agents. Each agent does one narrow task and fills a closed output schema. Code validates every output before it is used. Message and document content is always treated as data, so instructions hidden inside it are ignored.</w:t>
+      </w:r>
+    </w:p>
+    <w:p>
+      <w:r>
+        <w:rPr>
+          <w:b/>
+        </w:rPr>
+        <w:t>Table 7. AI agents and prompt design</w:t>
+      </w:r>
+    </w:p>
+    <w:tbl>
+      <w:tblPr>
+        <w:tblStyle w:val="TableGrid"/>
+        <w:tblW w:type="auto" w:w="0"/>
+        <w:tblLook w:firstColumn="1" w:firstRow="1" w:lastColumn="0" w:lastRow="0" w:noHBand="0" w:noVBand="1" w:val="04A0"/>
+      </w:tblPr>
+      <w:tblGrid>
+        <w:gridCol w:w="1440"/>
+        <w:gridCol w:w="1440"/>
+        <w:gridCol w:w="1440"/>
+        <w:gridCol w:w="1440"/>
+        <w:gridCol w:w="1440"/>
+        <w:gridCol w:w="1440"/>
+      </w:tblGrid>
+      <w:tr>
+        <w:tc>
+          <w:tcPr>
+            <w:tcW w:type="dxa" w:w="1440"/>
+          </w:tcPr>
+          <w:p>
+            <w:r>
+              <w:rPr>
+                <w:b/>
+                <w:sz w:val="18"/>
+              </w:rPr>
+            </w:r>
+            <w:r>
+              <w:rPr>
+                <w:b/>
+                <w:sz w:val="18"/>
+              </w:rPr>
+              <w:t>Agent</w:t>
+            </w:r>
+          </w:p>
+        </w:tc>
+        <w:tc>
+          <w:tcPr>
+            <w:tcW w:type="dxa" w:w="1440"/>
+          </w:tcPr>
+          <w:p>
+            <w:r>
+              <w:rPr>
+                <w:b/>
+                <w:sz w:val="18"/>
+              </w:rPr>
+            </w:r>
+            <w:r>
+              <w:rPr>
+                <w:b/>
+                <w:sz w:val="18"/>
+              </w:rPr>
+              <w:t>Task</w:t>
+            </w:r>
+          </w:p>
+        </w:tc>
+        <w:tc>
+          <w:tcPr>
+            <w:tcW w:type="dxa" w:w="1440"/>
+          </w:tcPr>
+          <w:p>
+            <w:r>
+              <w:rPr>
+                <w:b/>
+                <w:sz w:val="18"/>
+              </w:rPr>
+            </w:r>
+            <w:r>
+              <w:rPr>
+                <w:b/>
+                <w:sz w:val="18"/>
+              </w:rPr>
+              <w:t>Input</w:t>
+            </w:r>
+          </w:p>
+        </w:tc>
+        <w:tc>
+          <w:tcPr>
+            <w:tcW w:type="dxa" w:w="1440"/>
+          </w:tcPr>
+          <w:p>
+            <w:r>
+              <w:rPr>
+                <w:b/>
+                <w:sz w:val="18"/>
+              </w:rPr>
+            </w:r>
+            <w:r>
+              <w:rPr>
+                <w:b/>
+                <w:sz w:val="18"/>
+              </w:rPr>
+              <w:t>Prompt core</w:t>
+            </w:r>
+          </w:p>
+        </w:tc>
+        <w:tc>
+          <w:tcPr>
+            <w:tcW w:type="dxa" w:w="1440"/>
+          </w:tcPr>
+          <w:p>
+            <w:r>
+              <w:rPr>
+                <w:b/>
+                <w:sz w:val="18"/>
+              </w:rPr>
+            </w:r>
+            <w:r>
+              <w:rPr>
+                <w:b/>
+                <w:sz w:val="18"/>
+              </w:rPr>
+              <w:t>Output</w:t>
+            </w:r>
+          </w:p>
+        </w:tc>
+        <w:tc>
+          <w:tcPr>
+            <w:tcW w:type="dxa" w:w="1440"/>
+          </w:tcPr>
+          <w:p>
+            <w:r>
+              <w:rPr>
+                <w:b/>
+                <w:sz w:val="18"/>
+              </w:rPr>
+            </w:r>
+            <w:r>
+              <w:rPr>
+                <w:b/>
+                <w:sz w:val="18"/>
+              </w:rPr>
+              <w:t>Safeguard</w:t>
+            </w:r>
+          </w:p>
+        </w:tc>
+      </w:tr>
+      <w:tr>
+        <w:tc>
+          <w:tcPr>
+            <w:tcW w:type="dxa" w:w="1440"/>
+          </w:tcPr>
+          <w:p>
+            <w:r>
+              <w:rPr>
+                <w:sz w:val="18"/>
+              </w:rPr>
+            </w:r>
+            <w:r>
+              <w:rPr>
+                <w:sz w:val="18"/>
+              </w:rPr>
+              <w:t>Conversation Agent</w:t>
+            </w:r>
+          </w:p>
+        </w:tc>
+        <w:tc>
+          <w:tcPr>
+            <w:tcW w:type="dxa" w:w="1440"/>
+          </w:tcPr>
+          <w:p>
+            <w:r>
+              <w:rPr>
+                <w:sz w:val="18"/>
+              </w:rPr>
+            </w:r>
+            <w:r>
+              <w:rPr>
+                <w:sz w:val="18"/>
+              </w:rPr>
+              <w:t>Reads how a message relates to the conversation</w:t>
+            </w:r>
+          </w:p>
+        </w:tc>
+        <w:tc>
+          <w:tcPr>
+            <w:tcW w:type="dxa" w:w="1440"/>
+          </w:tcPr>
+          <w:p>
+            <w:r>
+              <w:rPr>
+                <w:sz w:val="18"/>
+              </w:rPr>
+            </w:r>
+            <w:r>
+              <w:rPr>
+                <w:sz w:val="18"/>
+              </w:rPr>
+              <w:t>Message, known facts, the agent's last question, the last four exchanges</w:t>
+            </w:r>
+          </w:p>
+        </w:tc>
+        <w:tc>
+          <w:tcPr>
+            <w:tcW w:type="dxa" w:w="1440"/>
+          </w:tcPr>
+          <w:p>
+            <w:r>
+              <w:rPr>
+                <w:sz w:val="18"/>
+              </w:rPr>
+            </w:r>
+            <w:r>
+              <w:rPr>
+                <w:sz w:val="18"/>
+              </w:rPr>
+              <w:t>Classify the message as an answer, correction, continuation, new situation, what-if or general question, with examples in two languages</w:t>
+            </w:r>
+          </w:p>
+        </w:tc>
+        <w:tc>
+          <w:tcPr>
+            <w:tcW w:type="dxa" w:w="1440"/>
+          </w:tcPr>
+          <w:p>
+            <w:r>
+              <w:rPr>
+                <w:sz w:val="18"/>
+              </w:rPr>
+            </w:r>
+            <w:r>
+              <w:rPr>
+                <w:sz w:val="18"/>
+              </w:rPr>
+              <w:t>One relation type, the message language and the facts that still apply</w:t>
+            </w:r>
+          </w:p>
+        </w:tc>
+        <w:tc>
+          <w:tcPr>
+            <w:tcW w:type="dxa" w:w="1440"/>
+          </w:tcPr>
+          <w:p>
+            <w:r>
+              <w:rPr>
+                <w:sz w:val="18"/>
+              </w:rPr>
+            </w:r>
+            <w:r>
+              <w:rPr>
+                <w:sz w:val="18"/>
+              </w:rPr>
+              <w:t>It can only drop facts. Facts are kept when the message brings no new event</w:t>
+            </w:r>
+          </w:p>
+        </w:tc>
+      </w:tr>
+      <w:tr>
+        <w:tc>
+          <w:tcPr>
+            <w:tcW w:type="dxa" w:w="1440"/>
+          </w:tcPr>
+          <w:p>
+            <w:r>
+              <w:rPr>
+                <w:sz w:val="18"/>
+              </w:rPr>
+            </w:r>
+            <w:r>
+              <w:rPr>
+                <w:sz w:val="18"/>
+              </w:rPr>
+              <w:t>Planner Agent</w:t>
+            </w:r>
+          </w:p>
+        </w:tc>
+        <w:tc>
+          <w:tcPr>
+            <w:tcW w:type="dxa" w:w="1440"/>
+          </w:tcPr>
+          <w:p>
+            <w:r>
+              <w:rPr>
+                <w:sz w:val="18"/>
+              </w:rPr>
+            </w:r>
+            <w:r>
+              <w:rPr>
+                <w:sz w:val="18"/>
+              </w:rPr>
+              <w:t>Decides intent, topic and tools</w:t>
+            </w:r>
+          </w:p>
+        </w:tc>
+        <w:tc>
+          <w:tcPr>
+            <w:tcW w:type="dxa" w:w="1440"/>
+          </w:tcPr>
+          <w:p>
+            <w:r>
+              <w:rPr>
+                <w:sz w:val="18"/>
+              </w:rPr>
+            </w:r>
+            <w:r>
+              <w:rPr>
+                <w:sz w:val="18"/>
+              </w:rPr>
+              <w:t>Message, typed situation, the last four exchanges</w:t>
+            </w:r>
+          </w:p>
+        </w:tc>
+        <w:tc>
+          <w:tcPr>
+            <w:tcW w:type="dxa" w:w="1440"/>
+          </w:tcPr>
+          <w:p>
+            <w:r>
+              <w:rPr>
+                <w:sz w:val="18"/>
+              </w:rPr>
+            </w:r>
+            <w:r>
+              <w:rPr>
+                <w:sz w:val="18"/>
+              </w:rPr>
+              <w:t>Write a short reading first, then pick an intent from a fixed list and the read-only tools needed, with examples in two languages</w:t>
+            </w:r>
+          </w:p>
+        </w:tc>
+        <w:tc>
+          <w:tcPr>
+            <w:tcW w:type="dxa" w:w="1440"/>
+          </w:tcPr>
+          <w:p>
+            <w:r>
+              <w:rPr>
+                <w:sz w:val="18"/>
+              </w:rPr>
+            </w:r>
+            <w:r>
+              <w:rPr>
+                <w:sz w:val="18"/>
+              </w:rPr>
+              <w:t>Intent, question topic, tools and an action-request flag</w:t>
+            </w:r>
+          </w:p>
+        </w:tc>
+        <w:tc>
+          <w:tcPr>
+            <w:tcW w:type="dxa" w:w="1440"/>
+          </w:tcPr>
+          <w:p>
+            <w:r>
+              <w:rPr>
+                <w:sz w:val="18"/>
+              </w:rPr>
+            </w:r>
+            <w:r>
+              <w:rPr>
+                <w:sz w:val="18"/>
+              </w:rPr>
+              <w:t>Safety classifications are decided by code. An action is accepted only on a clear request or an accepted offer</w:t>
+            </w:r>
+          </w:p>
+        </w:tc>
+      </w:tr>
+      <w:tr>
+        <w:tc>
+          <w:tcPr>
+            <w:tcW w:type="dxa" w:w="1440"/>
+          </w:tcPr>
+          <w:p>
+            <w:r>
+              <w:rPr>
+                <w:sz w:val="18"/>
+              </w:rPr>
+            </w:r>
+            <w:r>
+              <w:rPr>
+                <w:sz w:val="18"/>
+              </w:rPr>
+              <w:t>Fact Agent</w:t>
+            </w:r>
+          </w:p>
+        </w:tc>
+        <w:tc>
+          <w:tcPr>
+            <w:tcW w:type="dxa" w:w="1440"/>
+          </w:tcPr>
+          <w:p>
+            <w:r>
+              <w:rPr>
+                <w:sz w:val="18"/>
+              </w:rPr>
+            </w:r>
+            <w:r>
+              <w:rPr>
+                <w:sz w:val="18"/>
+              </w:rPr>
+              <w:t>Turns sentences into typed facts</w:t>
+            </w:r>
+          </w:p>
+        </w:tc>
+        <w:tc>
+          <w:tcPr>
+            <w:tcW w:type="dxa" w:w="1440"/>
+          </w:tcPr>
+          <w:p>
+            <w:r>
+              <w:rPr>
+                <w:sz w:val="18"/>
+              </w:rPr>
+            </w:r>
+            <w:r>
+              <w:rPr>
+                <w:sz w:val="18"/>
+              </w:rPr>
+              <w:t>Customer message</w:t>
+            </w:r>
+          </w:p>
+        </w:tc>
+        <w:tc>
+          <w:tcPr>
+            <w:tcW w:type="dxa" w:w="1440"/>
+          </w:tcPr>
+          <w:p>
+            <w:r>
+              <w:rPr>
+                <w:sz w:val="18"/>
+              </w:rPr>
+            </w:r>
+            <w:r>
+              <w:rPr>
+                <w:sz w:val="18"/>
+              </w:rPr>
+              <w:t>Fill a field only when the text states it, never guessing dates, ages, amounts or causes</w:t>
+            </w:r>
+          </w:p>
+        </w:tc>
+        <w:tc>
+          <w:tcPr>
+            <w:tcW w:type="dxa" w:w="1440"/>
+          </w:tcPr>
+          <w:p>
+            <w:r>
+              <w:rPr>
+                <w:sz w:val="18"/>
+              </w:rPr>
+            </w:r>
+            <w:r>
+              <w:rPr>
+                <w:sz w:val="18"/>
+              </w:rPr>
+              <w:t>Facts from a fixed vocabulary, such as admission date, days in hospital, bill, cause</w:t>
+            </w:r>
+          </w:p>
+        </w:tc>
+        <w:tc>
+          <w:tcPr>
+            <w:tcW w:type="dxa" w:w="1440"/>
+          </w:tcPr>
+          <w:p>
+            <w:r>
+              <w:rPr>
+                <w:sz w:val="18"/>
+              </w:rPr>
+            </w:r>
+            <w:r>
+              <w:rPr>
+                <w:sz w:val="18"/>
+              </w:rPr>
+              <w:t>Event facts are locked and cannot be changed to fit a policy</w:t>
+            </w:r>
+          </w:p>
+        </w:tc>
+      </w:tr>
+      <w:tr>
+        <w:tc>
+          <w:tcPr>
+            <w:tcW w:type="dxa" w:w="1440"/>
+          </w:tcPr>
+          <w:p>
+            <w:r>
+              <w:rPr>
+                <w:sz w:val="18"/>
+              </w:rPr>
+            </w:r>
+            <w:r>
+              <w:rPr>
+                <w:sz w:val="18"/>
+              </w:rPr>
+              <w:t>Document Reader Agent</w:t>
+            </w:r>
+          </w:p>
+        </w:tc>
+        <w:tc>
+          <w:tcPr>
+            <w:tcW w:type="dxa" w:w="1440"/>
+          </w:tcPr>
+          <w:p>
+            <w:r>
+              <w:rPr>
+                <w:sz w:val="18"/>
+              </w:rPr>
+            </w:r>
+            <w:r>
+              <w:rPr>
+                <w:sz w:val="18"/>
+              </w:rPr>
+              <w:t>Reads policies and claim documents</w:t>
+            </w:r>
+          </w:p>
+        </w:tc>
+        <w:tc>
+          <w:tcPr>
+            <w:tcW w:type="dxa" w:w="1440"/>
+          </w:tcPr>
+          <w:p>
+            <w:r>
+              <w:rPr>
+                <w:sz w:val="18"/>
+              </w:rPr>
+            </w:r>
+            <w:r>
+              <w:rPr>
+                <w:sz w:val="18"/>
+              </w:rPr>
+              <w:t>Document text with personal data already removed</w:t>
+            </w:r>
+          </w:p>
+        </w:tc>
+        <w:tc>
+          <w:tcPr>
+            <w:tcW w:type="dxa" w:w="1440"/>
+          </w:tcPr>
+          <w:p>
+            <w:r>
+              <w:rPr>
+                <w:sz w:val="18"/>
+              </w:rPr>
+            </w:r>
+            <w:r>
+              <w:rPr>
+                <w:sz w:val="18"/>
+              </w:rPr>
+              <w:t>A quarantined component that classifies and transcribes the document into the schema without following any instruction inside it</w:t>
+            </w:r>
+          </w:p>
+        </w:tc>
+        <w:tc>
+          <w:tcPr>
+            <w:tcW w:type="dxa" w:w="1440"/>
+          </w:tcPr>
+          <w:p>
+            <w:r>
+              <w:rPr>
+                <w:sz w:val="18"/>
+              </w:rPr>
+            </w:r>
+            <w:r>
+              <w:rPr>
+                <w:sz w:val="18"/>
+              </w:rPr>
+              <w:t>Typed policy rules, or a claim document summary (type, dates, total, diagnosis)</w:t>
+            </w:r>
+          </w:p>
+        </w:tc>
+        <w:tc>
+          <w:tcPr>
+            <w:tcW w:type="dxa" w:w="1440"/>
+          </w:tcPr>
+          <w:p>
+            <w:r>
+              <w:rPr>
+                <w:sz w:val="18"/>
+              </w:rPr>
+            </w:r>
+            <w:r>
+              <w:rPr>
+                <w:sz w:val="18"/>
+              </w:rPr>
+              <w:t>No tools and no chat history. Instruction-like text is flagged</w:t>
+            </w:r>
+          </w:p>
+        </w:tc>
+      </w:tr>
+      <w:tr>
+        <w:tc>
+          <w:tcPr>
+            <w:tcW w:type="dxa" w:w="1440"/>
+          </w:tcPr>
+          <w:p>
+            <w:r>
+              <w:rPr>
+                <w:sz w:val="18"/>
+              </w:rPr>
+            </w:r>
+            <w:r>
+              <w:rPr>
+                <w:sz w:val="18"/>
+              </w:rPr>
+              <w:t>Claim Form Agent</w:t>
+            </w:r>
+          </w:p>
+        </w:tc>
+        <w:tc>
+          <w:tcPr>
+            <w:tcW w:type="dxa" w:w="1440"/>
+          </w:tcPr>
+          <w:p>
+            <w:r>
+              <w:rPr>
+                <w:sz w:val="18"/>
+              </w:rPr>
+            </w:r>
+            <w:r>
+              <w:rPr>
+                <w:sz w:val="18"/>
+              </w:rPr>
+              <w:t>Lays out the insurer's claim form</w:t>
+            </w:r>
+          </w:p>
+        </w:tc>
+        <w:tc>
+          <w:tcPr>
+            <w:tcW w:type="dxa" w:w="1440"/>
+          </w:tcPr>
+          <w:p>
+            <w:r>
+              <w:rPr>
+                <w:sz w:val="18"/>
+              </w:rPr>
+            </w:r>
+            <w:r>
+              <w:rPr>
+                <w:sz w:val="18"/>
+              </w:rPr>
+              <w:t>The policy's claim clauses</w:t>
+            </w:r>
+          </w:p>
+        </w:tc>
+        <w:tc>
+          <w:tcPr>
+            <w:tcW w:type="dxa" w:w="1440"/>
+          </w:tcPr>
+          <w:p>
+            <w:r>
+              <w:rPr>
+                <w:sz w:val="18"/>
+              </w:rPr>
+            </w:r>
+            <w:r>
+              <w:rPr>
+                <w:sz w:val="18"/>
+              </w:rPr>
+              <w:t>Design a title, sections and fields in the insurer's own terms, each field bound to one data source</w:t>
+            </w:r>
+          </w:p>
+        </w:tc>
+        <w:tc>
+          <w:tcPr>
+            <w:tcW w:type="dxa" w:w="1440"/>
+          </w:tcPr>
+          <w:p>
+            <w:r>
+              <w:rPr>
+                <w:sz w:val="18"/>
+              </w:rPr>
+            </w:r>
+            <w:r>
+              <w:rPr>
+                <w:sz w:val="18"/>
+              </w:rPr>
+              <w:t>Form structure</w:t>
+            </w:r>
+          </w:p>
+        </w:tc>
+        <w:tc>
+          <w:tcPr>
+            <w:tcW w:type="dxa" w:w="1440"/>
+          </w:tcPr>
+          <w:p>
+            <w:r>
+              <w:rPr>
+                <w:sz w:val="18"/>
+              </w:rPr>
+            </w:r>
+            <w:r>
+              <w:rPr>
+                <w:sz w:val="18"/>
+              </w:rPr>
+              <w:t>Values are filled by code from the claim draft. The model never writes values</w:t>
+            </w:r>
+          </w:p>
+        </w:tc>
+      </w:tr>
+      <w:tr>
+        <w:tc>
+          <w:tcPr>
+            <w:tcW w:type="dxa" w:w="1440"/>
+          </w:tcPr>
+          <w:p>
+            <w:r>
+              <w:rPr>
+                <w:sz w:val="18"/>
+              </w:rPr>
+            </w:r>
+            <w:r>
+              <w:rPr>
+                <w:sz w:val="18"/>
+              </w:rPr>
+              <w:t>Explainer Agent</w:t>
+            </w:r>
+          </w:p>
+        </w:tc>
+        <w:tc>
+          <w:tcPr>
+            <w:tcW w:type="dxa" w:w="1440"/>
+          </w:tcPr>
+          <w:p>
+            <w:r>
+              <w:rPr>
+                <w:sz w:val="18"/>
+              </w:rPr>
+            </w:r>
+            <w:r>
+              <w:rPr>
+                <w:sz w:val="18"/>
+              </w:rPr>
+              <w:t>Words the reply</w:t>
+            </w:r>
+          </w:p>
+        </w:tc>
+        <w:tc>
+          <w:tcPr>
+            <w:tcW w:type="dxa" w:w="1440"/>
+          </w:tcPr>
+          <w:p>
+            <w:r>
+              <w:rPr>
+                <w:sz w:val="18"/>
+              </w:rPr>
+            </w:r>
+            <w:r>
+              <w:rPr>
+                <w:sz w:val="18"/>
+              </w:rPr>
+              <w:t>Engine results, the last four exchanges, six example replies</w:t>
+            </w:r>
+          </w:p>
+        </w:tc>
+        <w:tc>
+          <w:tcPr>
+            <w:tcW w:type="dxa" w:w="1440"/>
+          </w:tcPr>
+          <w:p>
+            <w:r>
+              <w:rPr>
+                <w:sz w:val="18"/>
+              </w:rPr>
+            </w:r>
+            <w:r>
+              <w:rPr>
+                <w:sz w:val="18"/>
+              </w:rPr>
+              <w:t>Write short reasoning notes, then two friendly and concise candidate replies in the customer's language</w:t>
+            </w:r>
+          </w:p>
+        </w:tc>
+        <w:tc>
+          <w:tcPr>
+            <w:tcW w:type="dxa" w:w="1440"/>
+          </w:tcPr>
+          <w:p>
+            <w:r>
+              <w:rPr>
+                <w:sz w:val="18"/>
+              </w:rPr>
+            </w:r>
+            <w:r>
+              <w:rPr>
+                <w:sz w:val="18"/>
+              </w:rPr>
+              <w:t>Candidate replies and the best pick</w:t>
+            </w:r>
+          </w:p>
+        </w:tc>
+        <w:tc>
+          <w:tcPr>
+            <w:tcW w:type="dxa" w:w="1440"/>
+          </w:tcPr>
+          <w:p>
+            <w:r>
+              <w:rPr>
+                <w:sz w:val="18"/>
+              </w:rPr>
+            </w:r>
+            <w:r>
+              <w:rPr>
+                <w:sz w:val="18"/>
+              </w:rPr>
+              <w:t>Every amount, date and identifier is checked against the engine. Clause quotes must match exactly</w:t>
+            </w:r>
+          </w:p>
+        </w:tc>
+      </w:tr>
+      <w:tr>
+        <w:tc>
+          <w:tcPr>
+            <w:tcW w:type="dxa" w:w="1440"/>
+          </w:tcPr>
+          <w:p>
+            <w:r>
+              <w:rPr>
+                <w:sz w:val="18"/>
+              </w:rPr>
+            </w:r>
+            <w:r>
+              <w:rPr>
+                <w:sz w:val="18"/>
+              </w:rPr>
+              <w:t>Watchdog Agent</w:t>
+            </w:r>
+          </w:p>
+        </w:tc>
+        <w:tc>
+          <w:tcPr>
+            <w:tcW w:type="dxa" w:w="1440"/>
+          </w:tcPr>
+          <w:p>
+            <w:r>
+              <w:rPr>
+                <w:sz w:val="18"/>
+              </w:rPr>
+            </w:r>
+            <w:r>
+              <w:rPr>
+                <w:sz w:val="18"/>
+              </w:rPr>
+              <w:t>Follows deadlines and insurer decisions</w:t>
+            </w:r>
+          </w:p>
+        </w:tc>
+        <w:tc>
+          <w:tcPr>
+            <w:tcW w:type="dxa" w:w="1440"/>
+          </w:tcPr>
+          <w:p>
+            <w:r>
+              <w:rPr>
+                <w:sz w:val="18"/>
+              </w:rPr>
+            </w:r>
+            <w:r>
+              <w:rPr>
+                <w:sz w:val="18"/>
+              </w:rPr>
+              <w:t>Claim status, the assessor's note, claim facts</w:t>
+            </w:r>
+          </w:p>
+        </w:tc>
+        <w:tc>
+          <w:tcPr>
+            <w:tcW w:type="dxa" w:w="1440"/>
+          </w:tcPr>
+          <w:p>
+            <w:r>
+              <w:rPr>
+                <w:sz w:val="18"/>
+              </w:rPr>
+            </w:r>
+            <w:r>
+              <w:rPr>
+                <w:sz w:val="18"/>
+              </w:rPr>
+              <w:t>Classify the assessor's note as a fixable defect, a reason that contradicts the policy, a valid reason or unclear</w:t>
+            </w:r>
+          </w:p>
+        </w:tc>
+        <w:tc>
+          <w:tcPr>
+            <w:tcW w:type="dxa" w:w="1440"/>
+          </w:tcPr>
+          <w:p>
+            <w:r>
+              <w:rPr>
+                <w:sz w:val="18"/>
+              </w:rPr>
+            </w:r>
+            <w:r>
+              <w:rPr>
+                <w:sz w:val="18"/>
+              </w:rPr>
+              <w:t>Note type and next step</w:t>
+            </w:r>
+          </w:p>
+        </w:tc>
+        <w:tc>
+          <w:tcPr>
+            <w:tcW w:type="dxa" w:w="1440"/>
+          </w:tcPr>
+          <w:p>
+            <w:r>
+              <w:rPr>
+                <w:sz w:val="18"/>
+              </w:rPr>
+            </w:r>
+            <w:r>
+              <w:rPr>
+                <w:sz w:val="18"/>
+              </w:rPr>
+              <w:t>It sends nothing. Appeals and resubmissions still wait for the customer's confirmation</w:t>
+            </w:r>
+          </w:p>
+        </w:tc>
+      </w:tr>
+    </w:tbl>
+    <w:p/>
+    <w:p>
+      <w:r>
+        <w:t>Every model call runs at temperature zero. If the model is unavailable, the customer receives a clear notice and can use their own API key.</w:t>
       </w:r>
     </w:p>
     <w:p>
@@ -1942,12 +3318,12 @@
         <w:rPr>
           <w:color w:val="14213D"/>
         </w:rPr>
-        <w:t>3.2 Tool calling</w:t>
+        <w:t>3.2 Planning and tool calling</w:t>
       </w:r>
     </w:p>
     <w:p>
       <w:r>
-        <w:t>Every tool is registered with a permission tier, argument types and a result type. Tool results are stored as typed handles with a trust label. Tier 2 tools accept handles only, so free text from documents or models cannot become an argument of a submission. When several policies could take a claim, the agent asks which one to file first, with one button per policy.</w:t>
+        <w:t>Planning runs in two layers. Code decides safety classifications first, then the Planner Agent reads the intent of the message in the context of the conversation. Every tool is registered with a permission tier, argument types and a result type. Tool results are stored as typed handles with a trust label. Tier 2 tools accept handles only, so text from documents or models cannot become an argument of a submission. When several policies could take a claim, the agent asks which one to file first.</w:t>
       </w:r>
     </w:p>
     <w:p>
@@ -1963,7 +3339,49 @@
     </w:p>
     <w:p>
       <w:r>
-        <w:t>The agent uses three kinds of memory. Session working memory holds typed facts, dates, documents read and any form waiting for confirmation. Conversation memory holds the last four exchanges as data for references such as "that one" or "the other policy". Chat history is stored per account in Postgres, so it can be opened from another device.</w:t>
+        <w:t>The agent uses three kinds of memory.</w:t>
+      </w:r>
+    </w:p>
+    <w:p>
+      <w:pPr>
+        <w:pStyle w:val="ListNumber"/>
+      </w:pPr>
+      <w:r>
+        <w:rPr>
+          <w:b/>
+        </w:rPr>
+        <w:t>Session memory</w:t>
+      </w:r>
+      <w:r>
+        <w:t xml:space="preserve"> holds facts, dates, documents read and any form waiting for confirmation.</w:t>
+      </w:r>
+    </w:p>
+    <w:p>
+      <w:pPr>
+        <w:pStyle w:val="ListNumber"/>
+      </w:pPr>
+      <w:r>
+        <w:rPr>
+          <w:b/>
+        </w:rPr>
+        <w:t>Conversation memory</w:t>
+      </w:r>
+      <w:r>
+        <w:t xml:space="preserve"> holds the last four exchanges to understand references such as "that one" or "the other policy".</w:t>
+      </w:r>
+    </w:p>
+    <w:p>
+      <w:pPr>
+        <w:pStyle w:val="ListNumber"/>
+      </w:pPr>
+      <w:r>
+        <w:rPr>
+          <w:b/>
+        </w:rPr>
+        <w:t>Account history</w:t>
+      </w:r>
+      <w:r>
+        <w:t xml:space="preserve"> stores conversations in Postgres so they can be opened from another device.</w:t>
       </w:r>
     </w:p>
     <w:p>
@@ -1979,7 +3397,7 @@
     </w:p>
     <w:p>
       <w:r>
-        <w:t>Policy information is retrieved from a typed clause store. Each policy has been compiled into rules such as covers, excludes, waiting period, filing deadline, pays and requires document. The rules engine retrieves the relevant rules by event, cause and insured person. This design was chosen because an insurance verdict needs the exact rule with its numbers and time windows. Every rule used can be shown with its original sentence. For diagnoses, the agent uses BM25 retrieval over 74,879 ICD-10 code descriptions, then the model picks one code from the candidate list and code verifies the pick.</w:t>
+        <w:t>Policy information is retrieved from a typed clause store. Each policy is compiled into rules such as covers, excludes, waiting period, filing deadline, pays and requires document. The rules engine retrieves the relevant rules by event, cause and insured person. This design was chosen because an insurance verdict needs the exact rule with its numbers and time windows. For diagnoses, the agent uses BM25 retrieval over 74,879 ICD-10 codes. The model picks one code from the candidate list, and code verifies the pick.</w:t>
       </w:r>
     </w:p>
     <w:p>
@@ -1995,66 +3413,53 @@
     </w:p>
     <w:p>
       <w:r>
-        <w:t xml:space="preserve">For one bill </w:t>
+        <w:t>For one hospital bill, ClauseLens layers the payers by the Indonesian coordination rules.</w:t>
+      </w:r>
+    </w:p>
+    <w:p>
+      <w:pPr>
+        <w:pStyle w:val="ListNumber"/>
+      </w:pPr>
+      <w:r>
+        <w:t>Jasa Raharja pays first for road accidents involving two or more vehicles.</w:t>
+      </w:r>
+    </w:p>
+    <w:p>
+      <w:pPr>
+        <w:pStyle w:val="ListNumber"/>
+      </w:pPr>
+      <w:r>
+        <w:t>BPJS Kesehatan pays when the hospital is a partner facility and membership is active.</w:t>
+      </w:r>
+    </w:p>
+    <w:p>
+      <w:pPr>
+        <w:pStyle w:val="ListNumber"/>
+      </w:pPr>
+      <w:r>
+        <w:t>Employer cover pays before personal cover.</w:t>
+      </w:r>
+    </w:p>
+    <w:p>
+      <w:pPr>
+        <w:pStyle w:val="ListNumber"/>
+      </w:pPr>
+      <w:r>
+        <w:t>Daily cash benefits are paid at the same time because they stack.</w:t>
+      </w:r>
+    </w:p>
+    <w:p>
+      <w:r>
+        <w:t xml:space="preserve">Each policy pays </w:t>
       </w:r>
       <w:r>
         <w:rPr>
           <w:i/>
         </w:rPr>
-        <w:t>B</w:t>
+        <w:t>min(policy cap, amount presented minus the member's cost sharing)</w:t>
       </w:r>
       <w:r>
-        <w:t xml:space="preserve"> and several policies, payers are layered by the Indonesian coordination rules. Jasa Raharja pays first for road accidents involving two or more vehicles. BPJS Kesehatan pays when the hospital is a partner facility and membership is active. Employer group cover pays before individual cover. Daily cash benefits are paid in parallel because they stack.</w:t>
-      </w:r>
-    </w:p>
-    <w:p>
-      <w:r>
-        <w:t xml:space="preserve">Policy </w:t>
-      </w:r>
-      <w:r>
-        <w:rPr>
-          <w:i/>
-        </w:rPr>
-        <w:t>i</w:t>
-      </w:r>
-      <w:r>
-        <w:t xml:space="preserve"> pays </w:t>
-      </w:r>
-      <w:r>
-        <w:rPr>
-          <w:i/>
-        </w:rPr>
-        <w:t>min(A_i, s_i − m_i)</w:t>
-      </w:r>
-      <w:r>
-        <w:t xml:space="preserve">. Here </w:t>
-      </w:r>
-      <w:r>
-        <w:rPr>
-          <w:i/>
-        </w:rPr>
-        <w:t>s_i</w:t>
-      </w:r>
-      <w:r>
-        <w:t xml:space="preserve"> is the amount presented, </w:t>
-      </w:r>
-      <w:r>
-        <w:rPr>
-          <w:i/>
-        </w:rPr>
-        <w:t>m_i</w:t>
-      </w:r>
-      <w:r>
-        <w:t xml:space="preserve"> is the member's cost sharing (deductible and co-payment) and </w:t>
-      </w:r>
-      <w:r>
-        <w:rPr>
-          <w:i/>
-        </w:rPr>
-        <w:t>A_i</w:t>
-      </w:r>
-      <w:r>
-        <w:t xml:space="preserve"> is the policy's payment cap. Each payer is presented only what is still unpaid, so the total never exceeds the bill. Within a layer, every claiming order is evaluated and the order that recovers the most is chosen.</w:t>
+        <w:t>. Each payer is presented only the part of the bill that is still unpaid, so the total never exceeds the bill. Within a layer, every claiming order is computed and the order that recovers the most is chosen.</w:t>
       </w:r>
     </w:p>
     <w:p>
@@ -2070,7 +3475,7 @@
     </w:p>
     <w:p>
       <w:r>
-        <w:t>The adjudication twin checks each clause that could deny a claim separately and lists every ground an assessor could raise. Documents are cross-checked, for example dates against days in hospital, diagnosis codes against the cause, and receipt totals against their line items. The result is a claim readiness score with the grounds that can be fixed. When a claim is denied, the engine searches for the smallest legitimate change that makes it covered, such as waiting until a date, providing a document or using another policy. Facts that describe what happened, such as cause, dates and diagnosis, are locked in code and are never changed.</w:t>
+        <w:t>Before a claim is filed, ClaimFlow assesses its readiness the way an insurer's assessor would. Each clause that could deny the claim is checked one by one. Documents are cross-checked, for example dates against days in hospital and receipt totals against their line items. The result is a readiness score with the grounds that can be fixed. If a claim is denied, the engine searches for the smallest legitimate change that makes it covered, such as providing a document or using another policy. Event facts are locked in code and are never changed.</w:t>
       </w:r>
     </w:p>
     <w:p>
@@ -2081,12 +3486,12 @@
         <w:rPr>
           <w:color w:val="14213D"/>
         </w:rPr>
-        <w:t>3.7 Prompt design</w:t>
+        <w:t>3.7 Guardrails and explainability</w:t>
       </w:r>
     </w:p>
     <w:p>
       <w:r>
-        <w:t>Every model call uses a closed output schema at temperature zero. The model fills choices from fixed lists, for example the intent, the relation of the message or one policy from a candidate list. Code validates every output before it is used. Customer messages and document content are marked as data in the prompt, and the model is instructed to ignore any instruction inside them. The planner and conversation prompts contain worked examples in Indonesian and English. The reply writer receives the engine's results and six example replies. The model writes short private reasoning notes, drafts two candidate replies and picks the better one.</w:t>
+        <w:t>Every answer can be traced. The "How was this decided" panel shows how the message was understood, the facts used, the clauses that applied, the engine's verdict, the wording check and the audit record numbers. The reply verifier makes sure every amount and date comes from the engine. If the first candidate fails, the second is checked, then a fixed text is used.</w:t>
       </w:r>
     </w:p>
     <w:p>
@@ -2097,23 +3502,20 @@
         <w:rPr>
           <w:color w:val="14213D"/>
         </w:rPr>
-        <w:t>3.8 Guardrails and explainability</w:t>
+        <w:t>3.8 Evaluation</w:t>
       </w:r>
     </w:p>
     <w:p>
       <w:r>
-        <w:t>A reply verifier checks that every amount, date, percentage and policy number in a reply comes from the engine's results. If the first candidate fails, the second is checked, then a fixed text is used. Clause quotes must match the policy text exactly. Every answer has a "How was this decided" panel that shows how the message was understood, the facts used, the clauses that applied, the engine's verdict, the wording check and the audit record numbers. If the model is unavailable, the customer is told plainly and can use their own API key.</w:t>
+        <w:t>Every evaluation can be rerun from the scripts listed in the Execution Evidence Index.</w:t>
       </w:r>
     </w:p>
     <w:p>
-      <w:pPr>
-        <w:pStyle w:val="Heading2"/>
-      </w:pPr>
       <w:r>
         <w:rPr>
-          <w:color w:val="14213D"/>
+          <w:b/>
         </w:rPr>
-        <w:t>3.9 Evaluation</w:t>
+        <w:t>Table 8. Evaluation results</w:t>
       </w:r>
     </w:p>
     <w:tbl>
@@ -2165,7 +3567,7 @@
                 <w:b/>
                 <w:sz w:val="18"/>
               </w:rPr>
-              <w:t>Dataset or scenario</w:t>
+              <w:t>Scenario</w:t>
             </w:r>
           </w:p>
         </w:tc>
@@ -2243,7 +3645,7 @@
               <w:rPr>
                 <w:sz w:val="18"/>
               </w:rPr>
-              <w:t>33 scripted tasks (20 functional, 10 adversarial, 3 recommendations)</w:t>
+              <w:t>33 scripted tasks</w:t>
             </w:r>
           </w:p>
         </w:tc>
@@ -2317,7 +3719,7 @@
               <w:rPr>
                 <w:sz w:val="18"/>
               </w:rPr>
-              <w:t>Public life insurance benchmark, 10 contracts, 580 labels (CC-BY-4.0)</w:t>
+              <w:t>Public life insurance benchmark, 580 labels</w:t>
             </w:r>
           </w:p>
         </w:tc>
@@ -2335,7 +3737,7 @@
               <w:rPr>
                 <w:sz w:val="18"/>
               </w:rPr>
-              <w:t>A model reading the whole contract (b0, b0cw)</w:t>
+              <w:t>A model reading the whole contract</w:t>
             </w:r>
           </w:p>
         </w:tc>
@@ -2353,7 +3755,7 @@
               <w:rPr>
                 <w:sz w:val="18"/>
               </w:rPr>
-              <w:t>84.6% with 1.4% invented denials. Baseline b0cw 87.5% with 3.1% invented denials on a 112-item subset</w:t>
+              <w:t>84.6% with 1.4% invented denials. Baseline 87.5% with 3.1% invented denials</w:t>
             </w:r>
           </w:p>
         </w:tc>
@@ -2373,7 +3775,7 @@
               <w:rPr>
                 <w:sz w:val="18"/>
               </w:rPr>
-              <w:t>Clarification</w:t>
+              <w:t>Question precision</w:t>
             </w:r>
           </w:p>
         </w:tc>
@@ -2391,7 +3793,7 @@
               <w:rPr>
                 <w:sz w:val="18"/>
               </w:rPr>
-              <w:t>18 messages with one fact removed per test, judged by an oracle</w:t>
+              <w:t>18 messages with one fact removed</w:t>
             </w:r>
           </w:p>
         </w:tc>
@@ -2447,7 +3849,7 @@
               <w:rPr>
                 <w:sz w:val="18"/>
               </w:rPr>
-              <w:t>Paraphrase consistency</w:t>
+              <w:t>Consistency</w:t>
             </w:r>
           </w:p>
         </w:tc>
@@ -2539,7 +3941,7 @@
               <w:rPr>
                 <w:sz w:val="18"/>
               </w:rPr>
-              <w:t>500 households with 200 real US marketplace plans</w:t>
+              <w:t>500 households, 200 US marketplace plans</w:t>
             </w:r>
           </w:p>
         </w:tc>
@@ -2557,7 +3959,7 @@
               <w:rPr>
                 <w:sz w:val="18"/>
               </w:rPr>
-              <w:t>Claiming in the order held, single policy only</w:t>
+              <w:t>Claiming in the order the policies are held</w:t>
             </w:r>
           </w:p>
         </w:tc>
@@ -2613,7 +4015,7 @@
               <w:rPr>
                 <w:sz w:val="18"/>
               </w:rPr>
-              <w:t>100 households, mixed catalogue</w:t>
+              <w:t>100 households</w:t>
             </w:r>
           </w:p>
         </w:tc>
@@ -2631,7 +4033,7 @@
               <w:rPr>
                 <w:sz w:val="18"/>
               </w:rPr>
-              <w:t>Cheapest plan, most expensive plan</w:t>
+              <w:t>Cheapest plan</w:t>
             </w:r>
           </w:p>
         </w:tc>
@@ -2649,7 +4051,7 @@
               <w:rPr>
                 <w:sz w:val="18"/>
               </w:rPr>
-              <w:t>Closes more gap in 73 and 79 of 100</w:t>
+              <w:t>Closes more gap in 73 of 100</w:t>
             </w:r>
           </w:p>
         </w:tc>
@@ -2669,7 +4071,7 @@
               <w:rPr>
                 <w:sz w:val="18"/>
               </w:rPr>
-              <w:t>Diagnosis coding</w:t>
+              <w:t>Diagnosis codes</w:t>
             </w:r>
           </w:p>
         </w:tc>
@@ -2687,7 +4089,7 @@
               <w:rPr>
                 <w:sz w:val="18"/>
               </w:rPr>
-              <w:t>76 labelled diagnosis lines</w:t>
+              <w:t>76 diagnosis lines</w:t>
             </w:r>
           </w:p>
         </w:tc>
@@ -2723,7 +4125,7 @@
               <w:rPr>
                 <w:sz w:val="18"/>
               </w:rPr>
-              <w:t>92.2% correct category. Alias dictionary 17.2%</w:t>
+              <w:t>92.2% correct. Alias dictionary 17.2%</w:t>
             </w:r>
           </w:p>
         </w:tc>
@@ -2761,7 +4163,7 @@
               <w:rPr>
                 <w:sz w:val="18"/>
               </w:rPr>
-              <w:t>47 narrative, slang, typo, correction and what-if turns</w:t>
+              <w:t>47 narrative turns</w:t>
             </w:r>
           </w:p>
         </w:tc>
@@ -2835,7 +4237,7 @@
               <w:rPr>
                 <w:sz w:val="18"/>
               </w:rPr>
-              <w:t>90 turns of the scripted tasks</w:t>
+              <w:t>90 turns</w:t>
             </w:r>
           </w:p>
         </w:tc>
@@ -2883,7 +4285,7 @@
         <w:rPr>
           <w:b/>
         </w:rPr>
-        <w:t>Ablation.</w:t>
+        <w:t>Table 9. Ablation</w:t>
       </w:r>
     </w:p>
     <w:tbl>
@@ -2991,7 +4393,7 @@
               <w:rPr>
                 <w:sz w:val="18"/>
               </w:rPr>
-              <w:t>Extracted rules replaced by the benchmark's gold rules</w:t>
+              <w:t>Extracted rules replaced by the benchmark's reference rules</w:t>
             </w:r>
           </w:p>
         </w:tc>
@@ -3009,7 +4411,7 @@
               <w:rPr>
                 <w:sz w:val="18"/>
               </w:rPr>
-              <w:t>Accuracy rises from 84.6% to 91.8%, so the remaining gap comes from document reading</w:t>
+              <w:t>Accuracy rises from 84.6% to 91.8%. The gap comes from document reading</w:t>
             </w:r>
           </w:p>
         </w:tc>
@@ -3067,7 +4469,7 @@
               <w:rPr>
                 <w:sz w:val="18"/>
               </w:rPr>
-              <w:t>Verdict-sensitivity clarification</w:t>
+              <w:t>Verdict-change questions</w:t>
             </w:r>
           </w:p>
         </w:tc>
@@ -3085,7 +4487,7 @@
               <w:rPr>
                 <w:sz w:val="18"/>
               </w:rPr>
-              <w:t>Without it the agent asks for every missing fact. With it, 35 of 35 irrelevant gaps were not asked about</w:t>
+              <w:t>The agent asks for every missing fact. With this component, 35 of 35 irrelevant gaps were not asked about</w:t>
             </w:r>
           </w:p>
         </w:tc>
@@ -3114,6 +4516,70 @@
         <w:t>4.1 Permission tiers</w:t>
       </w:r>
     </w:p>
+    <w:p>
+      <w:r>
+        <w:t>TrustLock places every agent action in one of four permission tiers. Figure 4 shows the path each action takes.</w:t>
+      </w:r>
+    </w:p>
+    <w:p>
+      <w:pPr>
+        <w:jc w:val="center"/>
+      </w:pPr>
+      <w:r>
+        <w:drawing>
+          <wp:inline xmlns:a="http://schemas.openxmlformats.org/drawingml/2006/main" xmlns:pic="http://schemas.openxmlformats.org/drawingml/2006/picture">
+            <wp:extent cx="5760720" cy="4013808"/>
+            <wp:docPr id="4" name="Picture 4"/>
+            <wp:cNvGraphicFramePr>
+              <a:graphicFrameLocks noChangeAspect="1"/>
+            </wp:cNvGraphicFramePr>
+            <a:graphic>
+              <a:graphicData uri="http://schemas.openxmlformats.org/drawingml/2006/picture">
+                <pic:pic>
+                  <pic:nvPicPr>
+                    <pic:cNvPr id="0" name="flow_tier_en.png"/>
+                    <pic:cNvPicPr/>
+                  </pic:nvPicPr>
+                  <pic:blipFill>
+                    <a:blip r:embed="rId12"/>
+                    <a:stretch>
+                      <a:fillRect/>
+                    </a:stretch>
+                  </pic:blipFill>
+                  <pic:spPr>
+                    <a:xfrm>
+                      <a:off x="0" y="0"/>
+                      <a:ext cx="5760720" cy="4013808"/>
+                    </a:xfrm>
+                    <a:prstGeom prst="rect"/>
+                  </pic:spPr>
+                </pic:pic>
+              </a:graphicData>
+            </a:graphic>
+          </wp:inline>
+        </w:drawing>
+      </w:r>
+    </w:p>
+    <w:p>
+      <w:pPr>
+        <w:jc w:val="center"/>
+      </w:pPr>
+      <w:r>
+        <w:rPr>
+          <w:i/>
+          <w:sz w:val="18"/>
+        </w:rPr>
+        <w:t>Figure 4. Permission flow for every agent action</w:t>
+      </w:r>
+    </w:p>
+    <w:p>
+      <w:r>
+        <w:rPr>
+          <w:b/>
+        </w:rPr>
+        <w:t>Table 10. Permission tiers</w:t>
+      </w:r>
+    </w:p>
     <w:tbl>
       <w:tblPr>
         <w:tblStyle w:val="TableGrid"/>
@@ -3121,15 +4587,14 @@
         <w:tblLook w:firstColumn="1" w:firstRow="1" w:lastColumn="0" w:lastRow="0" w:noHBand="0" w:noVBand="1" w:val="04A0"/>
       </w:tblPr>
       <w:tblGrid>
-        <w:gridCol w:w="2160"/>
-        <w:gridCol w:w="2160"/>
-        <w:gridCol w:w="2160"/>
-        <w:gridCol w:w="2160"/>
+        <w:gridCol w:w="2880"/>
+        <w:gridCol w:w="2880"/>
+        <w:gridCol w:w="2880"/>
       </w:tblGrid>
       <w:tr>
         <w:tc>
           <w:tcPr>
-            <w:tcW w:type="dxa" w:w="2160"/>
+            <w:tcW w:type="dxa" w:w="2880"/>
           </w:tcPr>
           <w:p>
             <w:r>
@@ -3149,7 +4614,7 @@
         </w:tc>
         <w:tc>
           <w:tcPr>
-            <w:tcW w:type="dxa" w:w="2160"/>
+            <w:tcW w:type="dxa" w:w="2880"/>
           </w:tcPr>
           <w:p>
             <w:r>
@@ -3169,7 +4634,7 @@
         </w:tc>
         <w:tc>
           <w:tcPr>
-            <w:tcW w:type="dxa" w:w="2160"/>
+            <w:tcW w:type="dxa" w:w="2880"/>
           </w:tcPr>
           <w:p>
             <w:r>
@@ -3184,26 +4649,6 @@
                 <w:sz w:val="18"/>
               </w:rPr>
               <w:t>Example actions</w:t>
-            </w:r>
-          </w:p>
-        </w:tc>
-        <w:tc>
-          <w:tcPr>
-            <w:tcW w:type="dxa" w:w="2160"/>
-          </w:tcPr>
-          <w:p>
-            <w:r>
-              <w:rPr>
-                <w:b/>
-                <w:sz w:val="18"/>
-              </w:rPr>
-            </w:r>
-            <w:r>
-              <w:rPr>
-                <w:b/>
-                <w:sz w:val="18"/>
-              </w:rPr>
-              <w:t>Rule</w:t>
             </w:r>
           </w:p>
         </w:tc>
@@ -3211,7 +4656,7 @@
       <w:tr>
         <w:tc>
           <w:tcPr>
-            <w:tcW w:type="dxa" w:w="2160"/>
+            <w:tcW w:type="dxa" w:w="2880"/>
           </w:tcPr>
           <w:p>
             <w:r>
@@ -3229,7 +4674,7 @@
         </w:tc>
         <w:tc>
           <w:tcPr>
-            <w:tcW w:type="dxa" w:w="2160"/>
+            <w:tcW w:type="dxa" w:w="2880"/>
           </w:tcPr>
           <w:p>
             <w:r>
@@ -3247,7 +4692,7 @@
         </w:tc>
         <w:tc>
           <w:tcPr>
-            <w:tcW w:type="dxa" w:w="2160"/>
+            <w:tcW w:type="dxa" w:w="2880"/>
           </w:tcPr>
           <w:p>
             <w:r>
@@ -3260,24 +4705,6 @@
                 <w:sz w:val="18"/>
               </w:rPr>
               <w:t>Read the customer's own policies, claim status, premium status and deadline reminders</w:t>
-            </w:r>
-          </w:p>
-        </w:tc>
-        <w:tc>
-          <w:tcPr>
-            <w:tcW w:type="dxa" w:w="2160"/>
-          </w:tcPr>
-          <w:p>
-            <w:r>
-              <w:rPr>
-                <w:sz w:val="18"/>
-              </w:rPr>
-            </w:r>
-            <w:r>
-              <w:rPr>
-                <w:sz w:val="18"/>
-              </w:rPr>
-              <w:t>Always restricted to the signed-in account</w:t>
             </w:r>
           </w:p>
         </w:tc>
@@ -3285,7 +4712,7 @@
       <w:tr>
         <w:tc>
           <w:tcPr>
-            <w:tcW w:type="dxa" w:w="2160"/>
+            <w:tcW w:type="dxa" w:w="2880"/>
           </w:tcPr>
           <w:p>
             <w:r>
@@ -3303,7 +4730,7 @@
         </w:tc>
         <w:tc>
           <w:tcPr>
-            <w:tcW w:type="dxa" w:w="2160"/>
+            <w:tcW w:type="dxa" w:w="2880"/>
           </w:tcPr>
           <w:p>
             <w:r>
@@ -3321,7 +4748,7 @@
         </w:tc>
         <w:tc>
           <w:tcPr>
-            <w:tcW w:type="dxa" w:w="2160"/>
+            <w:tcW w:type="dxa" w:w="2880"/>
           </w:tcPr>
           <w:p>
             <w:r>
@@ -3333,25 +4760,7 @@
               <w:rPr>
                 <w:sz w:val="18"/>
               </w:rPr>
-              <w:t>Check coverage, compute payer order, draft a claim, prepare a form, draft an appeal</w:t>
-            </w:r>
-          </w:p>
-        </w:tc>
-        <w:tc>
-          <w:tcPr>
-            <w:tcW w:type="dxa" w:w="2160"/>
-          </w:tcPr>
-          <w:p>
-            <w:r>
-              <w:rPr>
-                <w:sz w:val="18"/>
-              </w:rPr>
-            </w:r>
-            <w:r>
-              <w:rPr>
-                <w:sz w:val="18"/>
-              </w:rPr>
-              <w:t>No effect outside the session</w:t>
+              <w:t>Check coverage, compute payer order, draft a claim and its form, draft an appeal</w:t>
             </w:r>
           </w:p>
         </w:tc>
@@ -3359,7 +4768,7 @@
       <w:tr>
         <w:tc>
           <w:tcPr>
-            <w:tcW w:type="dxa" w:w="2160"/>
+            <w:tcW w:type="dxa" w:w="2880"/>
           </w:tcPr>
           <w:p>
             <w:r>
@@ -3377,7 +4786,7 @@
         </w:tc>
         <w:tc>
           <w:tcPr>
-            <w:tcW w:type="dxa" w:w="2160"/>
+            <w:tcW w:type="dxa" w:w="2880"/>
           </w:tcPr>
           <w:p>
             <w:r>
@@ -3395,7 +4804,7 @@
         </w:tc>
         <w:tc>
           <w:tcPr>
-            <w:tcW w:type="dxa" w:w="2160"/>
+            <w:tcW w:type="dxa" w:w="2880"/>
           </w:tcPr>
           <w:p>
             <w:r>
@@ -3407,25 +4816,7 @@
               <w:rPr>
                 <w:sz w:val="18"/>
               </w:rPr>
-              <w:t>File a claim, attach a document to a claim, file an appeal, book a call-back</w:t>
-            </w:r>
-          </w:p>
-        </w:tc>
-        <w:tc>
-          <w:tcPr>
-            <w:tcW w:type="dxa" w:w="2160"/>
-          </w:tcPr>
-          <w:p>
-            <w:r>
-              <w:rPr>
-                <w:sz w:val="18"/>
-              </w:rPr>
-            </w:r>
-            <w:r>
-              <w:rPr>
-                <w:sz w:val="18"/>
-              </w:rPr>
-              <w:t>Runs after the customer taps Confirm. The server issues a single-use token bound to the session, the tool and the exact arguments</w:t>
+              <w:t>File a claim, attach a document, file an appeal, book a call-back</w:t>
             </w:r>
           </w:p>
         </w:tc>
@@ -3433,7 +4824,7 @@
       <w:tr>
         <w:tc>
           <w:tcPr>
-            <w:tcW w:type="dxa" w:w="2160"/>
+            <w:tcW w:type="dxa" w:w="2880"/>
           </w:tcPr>
           <w:p>
             <w:r>
@@ -3451,7 +4842,7 @@
         </w:tc>
         <w:tc>
           <w:tcPr>
-            <w:tcW w:type="dxa" w:w="2160"/>
+            <w:tcW w:type="dxa" w:w="2880"/>
           </w:tcPr>
           <w:p>
             <w:r>
@@ -3469,7 +4860,7 @@
         </w:tc>
         <w:tc>
           <w:tcPr>
-            <w:tcW w:type="dxa" w:w="2160"/>
+            <w:tcW w:type="dxa" w:w="2880"/>
           </w:tcPr>
           <w:p>
             <w:r>
@@ -3482,24 +4873,6 @@
                 <w:sz w:val="18"/>
               </w:rPr>
               <w:t>Change the payout account, change a beneficiary, move money</w:t>
-            </w:r>
-          </w:p>
-        </w:tc>
-        <w:tc>
-          <w:tcPr>
-            <w:tcW w:type="dxa" w:w="2160"/>
-          </w:tcPr>
-          <w:p>
-            <w:r>
-              <w:rPr>
-                <w:sz w:val="18"/>
-              </w:rPr>
-            </w:r>
-            <w:r>
-              <w:rPr>
-                <w:sz w:val="18"/>
-              </w:rPr>
-              <w:t>No tool executes it. The agent opens a ticket for a person at the insurer, who verifies identity through a separate channel</w:t>
             </w:r>
           </w:p>
         </w:tc>
@@ -3522,6 +4895,14 @@
         <w:t>4.2 Threat model</w:t>
       </w:r>
     </w:p>
+    <w:p>
+      <w:r>
+        <w:rPr>
+          <w:b/>
+        </w:rPr>
+        <w:t>Table 11. Threats, controls and test results</w:t>
+      </w:r>
+    </w:p>
     <w:tbl>
       <w:tblPr>
         <w:tblStyle w:val="TableGrid"/>
@@ -3649,7 +5030,7 @@
               <w:rPr>
                 <w:sz w:val="18"/>
               </w:rPr>
-              <w:t>Hidden instructions in a hospital receipt, such as white text asking to approve the claim</w:t>
+              <w:t>Hidden white text in a receipt asking to approve the claim</w:t>
             </w:r>
           </w:p>
         </w:tc>
@@ -3667,7 +5048,7 @@
               <w:rPr>
                 <w:sz w:val="18"/>
               </w:rPr>
-              <w:t>Hidden-text scanner, a quarantined extractor with no tools, untrusted labels on document text, handle-only T2 arguments</w:t>
+              <w:t>Hidden-text scanner, quarantined Document Reader Agent, untrusted labels, handle-only T2 arguments</w:t>
             </w:r>
           </w:p>
         </w:tc>
@@ -3723,7 +5104,7 @@
               <w:rPr>
                 <w:sz w:val="18"/>
               </w:rPr>
-              <w:t>Asking for another customer's policies or claims, or for system internals</w:t>
+              <w:t>Asking for another customer's data or for system internals</w:t>
             </w:r>
           </w:p>
         </w:tc>
@@ -3741,7 +5122,7 @@
               <w:rPr>
                 <w:sz w:val="18"/>
               </w:rPr>
-              <w:t>Account isolation on every route, row-level security in the database, output filtering for account and identity numbers, removal of personal data before a document reaches the model</w:t>
+              <w:t>Account isolation, row-level security, filtering of account and identity numbers, removal of personal data before a document reaches the model</w:t>
             </w:r>
           </w:p>
         </w:tc>
@@ -3759,7 +5140,7 @@
               <w:rPr>
                 <w:sz w:val="18"/>
               </w:rPr>
-              <w:t>A second account gets a refusal or an empty list for the first account's uploads, chats and claims. Every attempt is recorded in the audit log</w:t>
+              <w:t>Other accounts get a refusal or an empty list. Every attempt is recorded in the audit log</w:t>
             </w:r>
           </w:p>
         </w:tc>
@@ -3797,7 +5178,7 @@
               <w:rPr>
                 <w:sz w:val="18"/>
               </w:rPr>
-              <w:t>Filing a claim without confirmation, changing a bank account with an urgent excuse</w:t>
+              <w:t>Filing a claim without confirmation or changing a bank account with an urgent excuse</w:t>
             </w:r>
           </w:p>
         </w:tc>
@@ -3815,7 +5196,7 @@
               <w:rPr>
                 <w:sz w:val="18"/>
               </w:rPr>
-              <w:t>Single-use confirmation tokens, no T3 tools, per-session action limits, a circuit breaker, a halt switch at the insurer's desk</w:t>
+              <w:t>Single-use confirmation tokens, no T3 tools, per-session action limits, a halt switch</w:t>
             </w:r>
           </w:p>
         </w:tc>
@@ -3833,7 +5214,7 @@
               <w:rPr>
                 <w:sz w:val="18"/>
               </w:rPr>
-              <w:t>Attacks without confirmation and account-change requests produced no effect</w:t>
+              <w:t>No submission or account change took place</w:t>
             </w:r>
           </w:p>
         </w:tc>
@@ -3889,7 +5270,7 @@
               <w:rPr>
                 <w:sz w:val="18"/>
               </w:rPr>
-              <w:t>Verdicts from the rules engine, a number and date check on replies, exact clause quotes, an indicative label</w:t>
+              <w:t>Verdicts from the rules engine, a number and date check, exact clause quotes, an indicative label</w:t>
             </w:r>
           </w:p>
         </w:tc>
@@ -3907,7 +5288,7 @@
               <w:rPr>
                 <w:sz w:val="18"/>
               </w:rPr>
-              <w:t>1.4% invented denials on the benchmark. Replies that state values outside the engine's results are rejected before they are shown</w:t>
+              <w:t>1.4% invented denials on the benchmark. Replies with values outside the engine's results are not shown</w:t>
             </w:r>
           </w:p>
         </w:tc>
@@ -3926,6 +5307,9 @@
       </w:r>
     </w:p>
     <w:p>
+      <w:pPr>
+        <w:pStyle w:val="ListNumber"/>
+      </w:pPr>
       <w:r>
         <w:rPr>
           <w:b/>
@@ -3933,10 +5317,13 @@
         <w:t>Transaction limits.</w:t>
       </w:r>
       <w:r>
-        <w:t xml:space="preserve"> A claim amount cap of IDR 100,000,000 per submission. At most three T2 actions and 60 tool calls per session. One T3 ticket per 24 hours. A session stops automatically after three permission denials.</w:t>
+        <w:t xml:space="preserve"> A claim cap of IDR 100,000,000 per submission, at most three T2 actions and 60 tool calls per session, one T3 ticket per 24 hours, and an automatic stop after three permission denials.</w:t>
       </w:r>
     </w:p>
     <w:p>
+      <w:pPr>
+        <w:pStyle w:val="ListNumber"/>
+      </w:pPr>
       <w:r>
         <w:rPr>
           <w:b/>
@@ -3944,10 +5331,13 @@
         <w:t>Audit log.</w:t>
       </w:r>
       <w:r>
-        <w:t xml:space="preserve"> Every message, plan, tool call, permission decision and reply is recorded in a hash chain. Each record carries the hash of the previous record, so a change to any record is detected on verification.</w:t>
+        <w:t xml:space="preserve"> Every message, plan, tool call, permission decision and reply is recorded in a hash chain, so a change to any record is detected on verification.</w:t>
       </w:r>
     </w:p>
     <w:p>
+      <w:pPr>
+        <w:pStyle w:val="ListNumber"/>
+      </w:pPr>
       <w:r>
         <w:rPr>
           <w:b/>
@@ -3955,10 +5345,13 @@
         <w:t>Human in the loop.</w:t>
       </w:r>
       <w:r>
-        <w:t xml:space="preserve"> The customer confirms every submission. A person at the insurer decides every claim at the claims desk. The insurer holds a halt switch that stops every agent action for every customer.</w:t>
+        <w:t xml:space="preserve"> The customer confirms every submission. Insurer staff decide every claim. The insurer holds a halt switch that stops every agent action.</w:t>
       </w:r>
     </w:p>
     <w:p>
+      <w:pPr>
+        <w:pStyle w:val="ListNumber"/>
+      </w:pPr>
       <w:r>
         <w:rPr>
           <w:b/>
@@ -3966,10 +5359,13 @@
         <w:t>Data privacy.</w:t>
       </w:r>
       <w:r>
-        <w:t xml:space="preserve"> National ID numbers, bank account numbers, card numbers, phone numbers, dates of birth and personal names are removed locally before a document is sent to the model. If any personal data remains, the model call is blocked. Customers sign in with a confirmed email, and each account's data is isolated.</w:t>
+        <w:t xml:space="preserve"> National ID numbers, bank account numbers, card numbers, phone numbers, dates of birth and personal names are removed locally before a document is sent to the model. Every account is isolated.</w:t>
       </w:r>
     </w:p>
     <w:p>
+      <w:pPr>
+        <w:pStyle w:val="ListNumber"/>
+      </w:pPr>
       <w:r>
         <w:rPr>
           <w:b/>
@@ -3977,12 +5373,12 @@
         <w:t>Regulatory compliance.</w:t>
       </w:r>
       <w:r>
-        <w:t xml:space="preserve"> Every answer is marked indicative and states that the policy wording prevails. After a rejection, the agent gives the official complaint route (the insurer's complaint unit, OJK contact 157 and the financial services dispute resolution body LAPS SJK). Identity verification (KYC) for sensitive changes is done by the insurer through a separate channel. The agent does not move funds, so AML screening stays with the insurer.</w:t>
+        <w:t xml:space="preserve"> Every answer is marked indicative. After a rejection, the agent gives the official complaint route (the insurer's complaint unit, OJK contact 157 and LAPS SJK). Identity verification (KYC) for sensitive changes is done by the insurer through a separate channel. The agent does not move funds, so AML screening stays with the insurer.</w:t>
       </w:r>
     </w:p>
     <w:p>
       <w:r>
-        <w:t>This topic does not use a blockchain, so key management, signing policy and transaction simulation for Topic F do not apply.</w:t>
+        <w:t>Topic D does not use a blockchain, so key management, signing policy and transaction simulation for Topic F do not apply.</w:t>
       </w:r>
     </w:p>
     <w:p>
@@ -4007,6 +5403,19 @@
         <w:t>5.1 Difference from existing solutions</w:t>
       </w:r>
     </w:p>
+    <w:p>
+      <w:r>
+        <w:t>Table 12 compares ClauseGuard with three kinds of solutions already available to customers.</w:t>
+      </w:r>
+    </w:p>
+    <w:p>
+      <w:r>
+        <w:rPr>
+          <w:b/>
+        </w:rPr>
+        <w:t>Table 12. Comparison with existing solutions</w:t>
+      </w:r>
+    </w:p>
     <w:tbl>
       <w:tblPr>
         <w:tblStyle w:val="TableGrid"/>
@@ -4137,7 +5546,7 @@
               <w:rPr>
                 <w:sz w:val="18"/>
               </w:rPr>
-              <w:t>Reads all of a customer's policies from different insurers together</w:t>
+              <w:t>Reads all policies from different insurers</w:t>
             </w:r>
           </w:p>
         </w:tc>
@@ -4155,7 +5564,7 @@
               <w:rPr>
                 <w:sz w:val="18"/>
               </w:rPr>
-              <w:t>Own products only</w:t>
+              <w:t>Own products</w:t>
             </w:r>
           </w:p>
         </w:tc>
@@ -4173,7 +5582,7 @@
               <w:rPr>
                 <w:sz w:val="18"/>
               </w:rPr>
-              <w:t>When uploaded, with no fixed rules</w:t>
+              <w:t>When uploaded</w:t>
             </w:r>
           </w:p>
         </w:tc>
@@ -4229,7 +5638,7 @@
               <w:rPr>
                 <w:sz w:val="18"/>
               </w:rPr>
-              <w:t>Coverage verdict with the deciding clause quoted</w:t>
+              <w:t>Verdict with the deciding clause quoted</w:t>
             </w:r>
           </w:p>
         </w:tc>
@@ -4301,7 +5710,7 @@
               <w:rPr>
                 <w:sz w:val="18"/>
               </w:rPr>
-              <w:t>Yes, computed by the rules engine</w:t>
+              <w:t>Yes</w:t>
             </w:r>
           </w:p>
         </w:tc>
@@ -4321,7 +5730,7 @@
               <w:rPr>
                 <w:sz w:val="18"/>
               </w:rPr>
-              <w:t>Payer order across policies, including BPJS and Jasa Raharja</w:t>
+              <w:t>Payer order including BPJS and Jasa Raharja</w:t>
             </w:r>
           </w:p>
         </w:tc>
@@ -4413,7 +5822,7 @@
               <w:rPr>
                 <w:sz w:val="18"/>
               </w:rPr>
-              <w:t>Fills in the insurer's own claim form from documents</w:t>
+              <w:t>Fills in the insurer's claim form from documents</w:t>
             </w:r>
           </w:p>
         </w:tc>
@@ -4505,7 +5914,7 @@
               <w:rPr>
                 <w:sz w:val="18"/>
               </w:rPr>
-              <w:t>Files a claim with confirmation and receives the decision in the chat</w:t>
+              <w:t>Files a claim and receives the decision in the chat</w:t>
             </w:r>
           </w:p>
         </w:tc>
@@ -4597,7 +6006,7 @@
               <w:rPr>
                 <w:sz w:val="18"/>
               </w:rPr>
-              <w:t>Checks whether a rejection has grounds for appeal</w:t>
+              <w:t>Checks grounds for appeal</w:t>
             </w:r>
           </w:p>
         </w:tc>
@@ -4669,7 +6078,7 @@
               <w:rPr>
                 <w:sz w:val="18"/>
               </w:rPr>
-              <w:t>Yes, with the clause</w:t>
+              <w:t>Yes</w:t>
             </w:r>
           </w:p>
         </w:tc>
@@ -4770,7 +6179,7 @@
     <w:p/>
     <w:p>
       <w:r>
-        <w:t>The core innovation is to treat an insurance policy as a program of rules. The language model understands the conversation and the documents. The rules engine computes what the customer is owed. Every answer can be proven with a clause.</w:t>
+        <w:t>The core innovation of ClauseGuard is to treat an insurance policy as a program of rules. The language model understands the conversation and the documents. The rules engine computes what the customer is owed. Every answer can be proven with a clause.</w:t>
       </w:r>
     </w:p>
     <w:p>
@@ -4795,7 +6204,7 @@
         <w:t>Everyday language.</w:t>
       </w:r>
       <w:r>
-        <w:t xml:space="preserve"> Customers write in Indonesian, English or a mix, including abbreviations and typos. The agent replies in the same language.</w:t>
+        <w:t xml:space="preserve"> Customers can write in Indonesian, English or a mix, including abbreviations and typos.</w:t>
       </w:r>
     </w:p>
     <w:p>
@@ -4806,7 +6215,7 @@
         <w:rPr>
           <w:b/>
         </w:rPr>
-        <w:t>One question only.</w:t>
+        <w:t>One question.</w:t>
       </w:r>
       <w:r>
         <w:t xml:space="preserve"> The agent asks only when the answer would change, with quick-reply buttons.</w:t>
@@ -4823,7 +6232,7 @@
         <w:t>Evidence cards.</w:t>
       </w:r>
       <w:r>
-        <w:t xml:space="preserve"> Verdicts per policy, clause quotes, payer order, claim readiness and the content of each document appear as cards. For follow-up questions the cards fold so the conversation stays short.</w:t>
+        <w:t xml:space="preserve"> Verdicts, clause quotes, payer order, claim readiness and document contents appear as cards that can be opened.</w:t>
       </w:r>
     </w:p>
     <w:p>
@@ -4837,7 +6246,7 @@
         <w:t>Correctable form.</w:t>
       </w:r>
       <w:r>
-        <w:t xml:space="preserve"> The claim form is shown before it is sent. The customer can change fields such as the hospital name or a date, and the form is rebuilt.</w:t>
+        <w:t xml:space="preserve"> The claim form is shown before it is sent and every field can be changed.</w:t>
       </w:r>
     </w:p>
     <w:p>
@@ -4865,7 +6274,7 @@
         <w:t>Proactive news.</w:t>
       </w:r>
       <w:r>
-        <w:t xml:space="preserve"> The insurer's decision appears in the chat without being asked for, with an explanation and the next step.</w:t>
+        <w:t xml:space="preserve"> The insurer's decision appears in the chat with an explanation and the next step.</w:t>
       </w:r>
     </w:p>
     <w:p>
@@ -4895,7 +6304,15 @@
     </w:p>
     <w:p>
       <w:r>
-        <w:t>This list is consistent with the risk register in the Security Self-Assessment. The K numbers refer to that document.</w:t>
+        <w:t>The list below is consistent with the risk register in the Security Self-Assessment. The K numbers refer to that document.</w:t>
+      </w:r>
+    </w:p>
+    <w:p>
+      <w:r>
+        <w:rPr>
+          <w:b/>
+        </w:rPr>
+        <w:t>Table 13. Limitations and known risks</w:t>
       </w:r>
     </w:p>
     <w:tbl>
@@ -4947,7 +6364,7 @@
                 <w:b/>
                 <w:sz w:val="18"/>
               </w:rPr>
-              <w:t>Limitation or risk</w:t>
+              <w:t>Risk</w:t>
             </w:r>
           </w:p>
         </w:tc>
@@ -4987,7 +6404,7 @@
                 <w:b/>
                 <w:sz w:val="18"/>
               </w:rPr>
-              <w:t>Current handling</w:t>
+              <w:t>Handling</w:t>
             </w:r>
           </w:p>
         </w:tc>
@@ -5025,7 +6442,7 @@
               <w:rPr>
                 <w:sz w:val="18"/>
               </w:rPr>
-              <w:t>The extractor is a model and can misread a value inside the schema. On the benchmark, extracted rules score 7 points below gold rules</w:t>
+              <w:t>The Document Reader Agent can misread a value. Extracted rules score 7 points below the benchmark's reference rules</w:t>
             </w:r>
           </w:p>
         </w:tc>
@@ -5061,7 +6478,7 @@
               <w:rPr>
                 <w:sz w:val="18"/>
               </w:rPr>
-              <w:t>Cross-checks of totals and line items, an unverified label, and the customer reviews values from documents before sending</w:t>
+              <w:t>Cross-checks, an unverified label, and the customer reviews values before sending</w:t>
             </w:r>
           </w:p>
         </w:tc>
@@ -5135,7 +6552,7 @@
               <w:rPr>
                 <w:sz w:val="18"/>
               </w:rPr>
-              <w:t>Verdicts from the rules engine, a number check on replies, an indicative label</w:t>
+              <w:t>Verdicts from the rules engine, a number check, an indicative label</w:t>
             </w:r>
           </w:p>
         </w:tc>
@@ -5173,7 +6590,7 @@
               <w:rPr>
                 <w:sz w:val="18"/>
               </w:rPr>
-              <w:t>Text drawn inside an image is not detected as hidden text (0 of 20)</w:t>
+              <w:t>Text drawn inside an image is not detected (0 of 20)</w:t>
             </w:r>
           </w:p>
         </w:tc>
@@ -5209,7 +6626,7 @@
               <w:rPr>
                 <w:sz w:val="18"/>
               </w:rPr>
-              <w:t>Typed extractor output, untrusted labels that block T2</w:t>
+              <w:t>Typed output and untrusted labels block T2</w:t>
             </w:r>
           </w:p>
         </w:tc>
@@ -5469,7 +6886,7 @@
               <w:rPr>
                 <w:sz w:val="18"/>
               </w:rPr>
-              <w:t>Dependence on a hosted model service and its quota</w:t>
+              <w:t>Dependence on the model service and its quota</w:t>
             </w:r>
           </w:p>
         </w:tc>
@@ -5505,7 +6922,7 @@
               <w:rPr>
                 <w:sz w:val="18"/>
               </w:rPr>
-              <w:t>Key rotation, a plain notice to the customer, and the option to use the customer's own key</w:t>
+              <w:t>Key rotation, a notice to the customer, and the option to use the customer's own key</w:t>
             </w:r>
           </w:p>
         </w:tc>
@@ -5543,7 +6960,7 @@
               <w:rPr>
                 <w:sz w:val="18"/>
               </w:rPr>
-              <w:t>Test sets are small and written by the team. The blind question batch for the model-free mode passed 3 of 14</w:t>
+              <w:t>Test sets are small and written by the team</w:t>
             </w:r>
           </w:p>
         </w:tc>
@@ -5617,7 +7034,7 @@
               <w:rPr>
                 <w:sz w:val="18"/>
               </w:rPr>
-              <w:t>Session working memory ends when the server restarts</w:t>
+              <w:t>Session memory ends when the server restarts</w:t>
             </w:r>
           </w:p>
         </w:tc>
@@ -5653,7 +7070,7 @@
               <w:rPr>
                 <w:sz w:val="18"/>
               </w:rPr>
-              <w:t>Chat history is stored, and the customer is told and asked to restate the situation</w:t>
+              <w:t>Chat history is stored and the customer is asked to restate the situation</w:t>
             </w:r>
           </w:p>
         </w:tc>
@@ -5667,7 +7084,7 @@
     </w:p>
     <w:p>
       <w:pPr>
-        <w:pStyle w:val="ListBullet"/>
+        <w:pStyle w:val="ListNumber"/>
       </w:pPr>
       <w:r>
         <w:t>The public benchmark covers life insurance only. Indonesian products are tested on hand-verified sandbox policies.</w:t>
@@ -5675,23 +7092,23 @@
     </w:p>
     <w:p>
       <w:pPr>
-        <w:pStyle w:val="ListBullet"/>
+        <w:pStyle w:val="ListNumber"/>
       </w:pPr>
       <w:r>
-        <w:t>The rules engine covers coverage, exclusion, period, rider and termination questions. 24 of 58 benchmark scenarios (dividends, investment-linked caps, estate planning) are outside its scope.</w:t>
+        <w:t>24 of 58 benchmark scenarios, such as dividends and estate planning, are outside the scope of the rules engine.</w:t>
       </w:r>
     </w:p>
     <w:p>
       <w:pPr>
-        <w:pStyle w:val="ListBullet"/>
+        <w:pStyle w:val="ListNumber"/>
       </w:pPr>
       <w:r>
-        <w:t>Amounts and payer rules for BPJS Kesehatan and Jasa Raharja are modelled from public regulation and marked to be verified with the payer. INA-CBG tariff grouping is not implemented.</w:t>
+        <w:t>BPJS Kesehatan and Jasa Raharja rules are modelled from public regulation. INA-CBG tariff grouping is not implemented.</w:t>
       </w:r>
     </w:p>
     <w:p>
       <w:pPr>
-        <w:pStyle w:val="ListBullet"/>
+        <w:pStyle w:val="ListNumber"/>
       </w:pPr>
       <w:r>
         <w:t>A claim that has been filed cannot be amended directly. A fixable rejection is followed by a new submission after the customer confirms.</w:t>
@@ -5710,7 +7127,7 @@
     </w:p>
     <w:p>
       <w:pPr>
-        <w:pStyle w:val="ListBullet"/>
+        <w:pStyle w:val="ListNumber"/>
       </w:pPr>
       <w:r>
         <w:t>Mridul, Kapa and Seneviratne (2026). A benchmark for gap and overlap analysis of insurance contracts. arXiv:2604.10853.</w:t>
@@ -5718,7 +7135,7 @@
     </w:p>
     <w:p>
       <w:pPr>
-        <w:pStyle w:val="ListBullet"/>
+        <w:pStyle w:val="ListNumber"/>
       </w:pPr>
       <w:r>
         <w:t>Debenedetti et al. (2025). CaMeL: defeating prompt injections by design. arXiv:2503.18813.</w:t>
@@ -5726,15 +7143,15 @@
     </w:p>
     <w:p>
       <w:pPr>
-        <w:pStyle w:val="ListBullet"/>
+        <w:pStyle w:val="ListNumber"/>
       </w:pPr>
       <w:r>
-        <w:t>Wachter, Mittelstadt and Russell (2017). Ustun, Spangher and Liu (2019). Counterfactual explanations and algorithmic recourse.</w:t>
+        <w:t>Wachter, Mittelstadt and Russell (2017). Counterfactual explanations without opening the black box.</w:t>
       </w:r>
     </w:p>
     <w:p>
       <w:pPr>
-        <w:pStyle w:val="ListBullet"/>
+        <w:pStyle w:val="ListNumber"/>
       </w:pPr>
       <w:r>
         <w:t>OWASP Top 10 for Agentic Applications (2026).</w:t>
@@ -5742,7 +7159,7 @@
     </w:p>
     <w:p>
       <w:pPr>
-        <w:pStyle w:val="ListBullet"/>
+        <w:pStyle w:val="ListNumber"/>
       </w:pPr>
       <w:r>
         <w:t>KFF (2025). HealthCare.gov insurers denied nearly 1 in 5 in-network claims in 2023.</w:t>
@@ -5750,7 +7167,7 @@
     </w:p>
     <w:p>
       <w:pPr>
-        <w:pStyle w:val="ListBullet"/>
+        <w:pStyle w:val="ListNumber"/>
       </w:pPr>
       <w:r>
         <w:t>OJK (2023). Claim difficulty is the most reported insurance complaint.</w:t>

</xml_diff>